<commit_message>
refactor(day22): streamline deliverables, apply Times New Roman 13pt format, and refine professional language
</commit_message>
<xml_diff>
--- a/MinhNQ_Day22_onepager.docx
+++ b/MinhNQ_Day22_onepager.docx
@@ -9,11 +9,11 @@
       </w:pPr>
       <w:r>
         <w:rPr>
-          <w:rFonts w:ascii="Arial" w:cs="Arial" w:eastAsia="Arial" w:hAnsi="Arial"/>
-          <w:b w:val="1"/>
+          <w:rFonts w:ascii="Times New Roman" w:cs="Times New Roman" w:eastAsia="Arial" w:hAnsi="Times New Roman"/>
+          <w:b/>
           <w:bCs w:val="1"/>
           <w:color w:val="666666"/>
-          <w:sz w:val="16"/>
+          <w:sz w:val="28"/>
           <w:szCs w:val="16"/>
           <w:rtl w:val="0"/>
         </w:rPr>
@@ -21,10 +21,11 @@
       </w:r>
       <w:r>
         <w:rPr>
-          <w:b w:val="1"/>
+          <w:rFonts w:ascii="Times New Roman" w:hAnsi="Times New Roman" w:cs="Times New Roman"/>
+          <w:b/>
           <w:bCs w:val="1"/>
           <w:color w:val="666666"/>
-          <w:sz w:val="16"/>
+          <w:sz w:val="28"/>
           <w:szCs w:val="16"/>
           <w:rtl w:val="0"/>
         </w:rPr>
@@ -32,11 +33,11 @@
       </w:r>
       <w:r>
         <w:rPr>
-          <w:rFonts w:ascii="Arial" w:cs="Arial" w:eastAsia="Arial" w:hAnsi="Arial"/>
-          <w:b w:val="1"/>
+          <w:rFonts w:ascii="Times New Roman" w:cs="Times New Roman" w:eastAsia="Arial" w:hAnsi="Times New Roman"/>
+          <w:b/>
           <w:bCs w:val="1"/>
           <w:color w:val="666666"/>
-          <w:sz w:val="16"/>
+          <w:sz w:val="28"/>
           <w:szCs w:val="16"/>
           <w:rtl w:val="0"/>
         </w:rPr>
@@ -44,6 +45,9 @@
       </w:r>
       <w:r>
         <w:rPr>
+          <w:rFonts w:ascii="Times New Roman" w:hAnsi="Times New Roman" w:cs="Times New Roman"/>
+          <w:b/>
+          <w:sz w:val="28"/>
           <w:rtl w:val="0"/>
         </w:rPr>
       </w:r>
@@ -55,10 +59,10 @@
       </w:pPr>
       <w:r>
         <w:rPr>
-          <w:rFonts w:ascii="Arial" w:cs="Arial" w:eastAsia="Arial" w:hAnsi="Arial"/>
-          <w:b w:val="1"/>
+          <w:rFonts w:ascii="Times New Roman" w:cs="Times New Roman" w:eastAsia="Arial" w:hAnsi="Times New Roman"/>
+          <w:b/>
           <w:bCs w:val="1"/>
-          <w:sz w:val="32"/>
+          <w:sz w:val="28"/>
           <w:szCs w:val="32"/>
           <w:rtl w:val="0"/>
         </w:rPr>
@@ -66,6 +70,9 @@
       </w:r>
       <w:r>
         <w:rPr>
+          <w:rFonts w:ascii="Times New Roman" w:hAnsi="Times New Roman" w:cs="Times New Roman"/>
+          <w:b/>
+          <w:sz w:val="28"/>
           <w:rtl w:val="0"/>
         </w:rPr>
       </w:r>
@@ -76,7 +83,11 @@
         <w:rPr/>
       </w:pPr>
       <w:r>
-        <w:t>Tên / Nhóm: Ninh Quang Minh (MSSV: 2A202602432)     Sản phẩm: Trợ lý AI Tiếp nhận &amp; Phân tầng Triệu chứng Y tế (Vinmec Clinical Triage Assistant)</w:t>
+        <w:rPr>
+          <w:rFonts w:ascii="Times New Roman" w:hAnsi="Times New Roman" w:cs="Times New Roman"/>
+          <w:sz w:val="26"/>
+        </w:rPr>
+        <w:t>Tên / Nhóm: Ninh Quang Minh (MSSV: 2A202602432)     Sản phẩm: Trợ lý AI Tiếp nhận &amp; Phân tầng Triệu chứng Y tế (Vinmec Clinical Triage)</w:t>
       </w:r>
     </w:p>
     <w:p>
@@ -88,7 +99,11 @@
         <w:rPr/>
       </w:pPr>
       <w:r>
-        <w:t>Value Metric đã chọn: Hybrid (Phí nền + Outcome)     Kênh đã chọn: Partner-Led (Vinmec)     Ngày: 08/10/2026</w:t>
+        <w:rPr>
+          <w:rFonts w:ascii="Times New Roman" w:hAnsi="Times New Roman" w:cs="Times New Roman"/>
+          <w:sz w:val="26"/>
+        </w:rPr>
+        <w:t>Value Metric: Hybrid (Phí nền + Outcome)     Kênh: Partner-Led (Vinmec)     Ngày: 08/10/2026</w:t>
       </w:r>
     </w:p>
     <w:p>
@@ -98,43 +113,10 @@
       </w:pPr>
       <w:r>
         <w:rPr>
-          <w:rFonts w:ascii="Arial" w:cs="Arial" w:eastAsia="Arial" w:hAnsi="Arial"/>
-          <w:i w:val="1"/>
-          <w:iCs w:val="1"/>
-          <w:color w:val="666666"/>
-          <w:sz w:val="16"/>
-          <w:szCs w:val="16"/>
-          <w:rtl w:val="0"/>
-        </w:rPr>
-        <w:t xml:space="preserve">Mọi con số dưới đây phải truy được về một ô trong day2</w:t>
-      </w:r>
-      <w:r>
-        <w:rPr>
-          <w:i w:val="1"/>
-          <w:iCs w:val="1"/>
-          <w:color w:val="666666"/>
-          <w:sz w:val="16"/>
-          <w:szCs w:val="16"/>
-          <w:rtl w:val="0"/>
-        </w:rPr>
-        <w:t xml:space="preserve">2</w:t>
-      </w:r>
-      <w:r>
-        <w:rPr>
-          <w:rFonts w:ascii="Arial" w:cs="Arial" w:eastAsia="Arial" w:hAnsi="Arial"/>
-          <w:i w:val="1"/>
-          <w:iCs w:val="1"/>
-          <w:color w:val="666666"/>
-          <w:sz w:val="16"/>
-          <w:szCs w:val="16"/>
-          <w:rtl w:val="0"/>
-        </w:rPr>
-        <w:t xml:space="preserve">_monetization_model.xlsx. Số không có lý do = số ảo.</w:t>
-      </w:r>
-      <w:r>
-        <w:rPr>
-          <w:rtl w:val="0"/>
-        </w:rPr>
+          <w:rFonts w:ascii="Times New Roman" w:hAnsi="Times New Roman" w:cs="Times New Roman"/>
+          <w:sz w:val="26"/>
+        </w:rPr>
+        <w:t>Mọi số liệu dưới đây được đối chiếu trực tiếp từ file MinhNQ_Day22_model.xlsx.</w:t>
       </w:r>
     </w:p>
     <w:p>
@@ -144,34 +126,37 @@
       </w:pPr>
       <w:r>
         <w:rPr>
-          <w:rFonts w:ascii="Arial" w:cs="Arial" w:eastAsia="Arial" w:hAnsi="Arial"/>
+          <w:rFonts w:ascii="Times New Roman" w:cs="Times New Roman" w:eastAsia="Arial" w:hAnsi="Times New Roman"/>
+          <w:b/>
+          <w:bCs w:val="1"/>
+          <w:color w:val="4f46e5"/>
+          <w:sz w:val="28"/>
+          <w:szCs w:val="24"/>
+          <w:rtl w:val="0"/>
+        </w:rPr>
+        <w:t xml:space="preserve">1 · PRICING</w:t>
+      </w:r>
+      <w:r>
+        <w:rPr>
+          <w:rFonts w:ascii="Times New Roman" w:hAnsi="Times New Roman" w:cs="Times New Roman"/>
+          <w:b/>
+          <w:sz w:val="28"/>
+          <w:rtl w:val="0"/>
+        </w:rPr>
+      </w:r>
+    </w:p>
+    <w:p>
+      <w:pPr>
+        <w:spacing w:after="40" w:before="0" w:lineRule="auto"/>
+        <w:rPr/>
+      </w:pPr>
+      <w:r>
+        <w:rPr>
+          <w:rFonts w:ascii="Times New Roman" w:cs="Times New Roman" w:eastAsia="Arial" w:hAnsi="Times New Roman"/>
           <w:b w:val="1"/>
           <w:bCs w:val="1"/>
           <w:color w:val="4f46e5"/>
-          <w:sz w:val="24"/>
-          <w:szCs w:val="24"/>
-          <w:rtl w:val="0"/>
-        </w:rPr>
-        <w:t xml:space="preserve">1 · PRICING</w:t>
-      </w:r>
-      <w:r>
-        <w:rPr>
-          <w:rtl w:val="0"/>
-        </w:rPr>
-      </w:r>
-    </w:p>
-    <w:p>
-      <w:pPr>
-        <w:spacing w:after="40" w:before="0" w:lineRule="auto"/>
-        <w:rPr/>
-      </w:pPr>
-      <w:r>
-        <w:rPr>
-          <w:rFonts w:ascii="Arial" w:cs="Arial" w:eastAsia="Arial" w:hAnsi="Arial"/>
-          <w:b w:val="1"/>
-          <w:bCs w:val="1"/>
-          <w:color w:val="4f46e5"/>
-          <w:sz w:val="16"/>
+          <w:sz w:val="26"/>
           <w:szCs w:val="16"/>
           <w:rtl w:val="0"/>
         </w:rPr>
@@ -179,6 +164,8 @@
       </w:r>
       <w:r>
         <w:rPr>
+          <w:rFonts w:ascii="Times New Roman" w:hAnsi="Times New Roman" w:cs="Times New Roman"/>
+          <w:sz w:val="26"/>
           <w:rtl w:val="0"/>
         </w:rPr>
       </w:r>
@@ -189,9 +176,13 @@
         <w:rPr/>
       </w:pPr>
       <w:r>
+        <w:rPr>
+          <w:rFonts w:ascii="Times New Roman" w:hAnsi="Times New Roman" w:cs="Times New Roman"/>
+          <w:sz w:val="26"/>
+        </w:rPr>
         <w:t>Tiền trả cho bạn đến từ ngân sách nào? Phần mềm / Nhân sự / Vận hành / Marketing — và AI là người ký duyệt?</w:t>
         <w:br/>
-        <w:t>→ Ngân sách Vận hành / Khám chữa bệnh &amp; CSKH Y tế (Clinical Operations &amp; Patient Intake Budget) của Bệnh viện &amp; Phòng khám. Người ký duyệt: Giám đốc Vận hành Y tế (COO) &amp; Giám đốc Chuyên môn Lâm sàng (CMO). Không đi qua ngân sách Phần mềm/IT để tránh bị so sánh với công cụ SaaS thông thường và không bị ách tắc tại thủ tục thẩm định phần mềm.</w:t>
+        <w:t>Trả lời: Ngân sách Vận hành và Chăm sóc khách hàng Y tế (Clinical Operations &amp; Patient Intake Budget). Người ký duyệt: Giám đốc Vận hành (COO) và Giám đốc Chuyên môn Lâm sàng (CMO). Đóng gói theo nghiệp vụ thay thế ca trực sơ loại để tránh phụ thuộc vào ngân sách IT/Phần mềm.</w:t>
       </w:r>
     </w:p>
     <w:p>
@@ -204,8 +195,8 @@
       </w:pPr>
       <w:r>
         <w:rPr>
-          <w:rFonts w:ascii="Arial" w:cs="Arial" w:eastAsia="Arial" w:hAnsi="Arial"/>
-          <w:sz w:val="20"/>
+          <w:rFonts w:ascii="Times New Roman" w:cs="Times New Roman" w:eastAsia="Arial" w:hAnsi="Times New Roman"/>
+          <w:sz w:val="26"/>
           <w:szCs w:val="20"/>
           <w:rtl w:val="0"/>
         </w:rPr>
@@ -213,6 +204,8 @@
       </w:r>
       <w:r>
         <w:rPr>
+          <w:rFonts w:ascii="Times New Roman" w:hAnsi="Times New Roman" w:cs="Times New Roman"/>
+          <w:sz w:val="26"/>
           <w:rtl w:val="0"/>
         </w:rPr>
       </w:r>
@@ -227,8 +220,8 @@
       </w:pPr>
       <w:r>
         <w:rPr>
-          <w:rFonts w:ascii="Arial" w:cs="Arial" w:eastAsia="Arial" w:hAnsi="Arial"/>
-          <w:sz w:val="20"/>
+          <w:rFonts w:ascii="Times New Roman" w:cs="Times New Roman" w:eastAsia="Arial" w:hAnsi="Times New Roman"/>
+          <w:sz w:val="26"/>
           <w:szCs w:val="20"/>
           <w:rtl w:val="0"/>
         </w:rPr>
@@ -236,6 +229,8 @@
       </w:r>
       <w:r>
         <w:rPr>
+          <w:rFonts w:ascii="Times New Roman" w:hAnsi="Times New Roman" w:cs="Times New Roman"/>
+          <w:sz w:val="26"/>
           <w:rtl w:val="0"/>
         </w:rPr>
       </w:r>
@@ -247,11 +242,11 @@
       </w:pPr>
       <w:r>
         <w:rPr>
-          <w:rFonts w:ascii="Arial" w:cs="Arial" w:eastAsia="Arial" w:hAnsi="Arial"/>
+          <w:rFonts w:ascii="Times New Roman" w:cs="Times New Roman" w:eastAsia="Arial" w:hAnsi="Times New Roman"/>
           <w:b w:val="1"/>
           <w:bCs w:val="1"/>
           <w:color w:val="4f46e5"/>
-          <w:sz w:val="16"/>
+          <w:sz w:val="26"/>
           <w:szCs w:val="16"/>
           <w:rtl w:val="0"/>
         </w:rPr>
@@ -259,6 +254,8 @@
       </w:r>
       <w:r>
         <w:rPr>
+          <w:rFonts w:ascii="Times New Roman" w:hAnsi="Times New Roman" w:cs="Times New Roman"/>
+          <w:sz w:val="26"/>
           <w:rtl w:val="0"/>
         </w:rPr>
       </w:r>
@@ -269,9 +266,13 @@
         <w:rPr/>
       </w:pPr>
       <w:r>
+        <w:rPr>
+          <w:rFonts w:ascii="Times New Roman" w:hAnsi="Times New Roman" w:cs="Times New Roman"/>
+          <w:sz w:val="26"/>
+        </w:rPr>
         <w:t>Seat / Usage / Outcome / Hybrid. Nêu điểm Attribution và Autonomy, và bằng chứng. Nếu lệch khỏi gợi ý của model, nêu lý do thị trường.</w:t>
         <w:br/>
-        <w:t>→ Chọn mô hình Hybrid: Phí nền duy trì hạ tầng &amp; bảo mật y tế ($300/tháng/cơ sở) + $0,79 / ca tiếp nhận &amp; phân tầng hoàn thành (Qualified Clinical Triage Outcome). Điểm Attribution đạt 9/10 (log chi tiết session ID, timestamp, phân tầng ESI nối trực tiếp vào hệ thống đặt hẹn HIS; định nghĩa chặt chẽ chỉ tính tiền ca hoàn thành, không tính ca drop dưới 2 turn hoặc spam). Điểm Autonomy đạt 6/10 (AI tự động xử lý ca nhẹ cấp độ 4–5, ca cờ đỏ cấp độ 1–3 kích hoạt chuyển tuyến điều dưỡng). Model gợi ý USAGE, nhưng ghi đè (Market override) sang HYBRID vì y tế là ngành high-stakes; bệnh viện sợ hóa đơn token không dự toán được, còn nhà cung cấp không thể gánh 100% chi phí tuân thủ HIPAA/Nghị định 13 nếu chỉ bán outcome thuần không có phí nền.</w:t>
+        <w:t>Trả lời: Chọn Hybrid — Phí nền duy trì hạ tầng bảo mật ($300/tháng/cơ sở) + $0,79/ca hoàn thành (Qualified Clinical Triage Outcome). Điểm Attribution đạt 9/10 (lưu vết đầy đủ session ID và phân tầng ESI kết nối hệ thống HIS; chỉ tính tiền ca hoàn thành, không tính ca hủy dưới 2 lượt chat). Điểm Autonomy đạt 6/10 (AI xử lý ca nhẹ ESI 4–5; ca cờ đỏ ESI 1–3 tự động chuyển tiếp điều dưỡng trực). Model gợi ý USAGE, nhưng ghi đè sang HYBRID vì y tế là ngành rủi ro cao; bệnh viện cần kiểm soát ngân sách còn nhà cung cấp cần bù đắp chi phí hạ tầng bảo mật dữ liệu y tế.</w:t>
       </w:r>
     </w:p>
     <w:p>
@@ -284,8 +285,8 @@
       </w:pPr>
       <w:r>
         <w:rPr>
-          <w:rFonts w:ascii="Arial" w:cs="Arial" w:eastAsia="Arial" w:hAnsi="Arial"/>
-          <w:sz w:val="20"/>
+          <w:rFonts w:ascii="Times New Roman" w:cs="Times New Roman" w:eastAsia="Arial" w:hAnsi="Times New Roman"/>
+          <w:sz w:val="26"/>
           <w:szCs w:val="20"/>
           <w:rtl w:val="0"/>
         </w:rPr>
@@ -293,6 +294,8 @@
       </w:r>
       <w:r>
         <w:rPr>
+          <w:rFonts w:ascii="Times New Roman" w:hAnsi="Times New Roman" w:cs="Times New Roman"/>
+          <w:sz w:val="26"/>
           <w:rtl w:val="0"/>
         </w:rPr>
       </w:r>
@@ -307,8 +310,8 @@
       </w:pPr>
       <w:r>
         <w:rPr>
-          <w:rFonts w:ascii="Arial" w:cs="Arial" w:eastAsia="Arial" w:hAnsi="Arial"/>
-          <w:sz w:val="20"/>
+          <w:rFonts w:ascii="Times New Roman" w:cs="Times New Roman" w:eastAsia="Arial" w:hAnsi="Times New Roman"/>
+          <w:sz w:val="26"/>
           <w:szCs w:val="20"/>
           <w:rtl w:val="0"/>
         </w:rPr>
@@ -316,6 +319,8 @@
       </w:r>
       <w:r>
         <w:rPr>
+          <w:rFonts w:ascii="Times New Roman" w:hAnsi="Times New Roman" w:cs="Times New Roman"/>
+          <w:sz w:val="26"/>
           <w:rtl w:val="0"/>
         </w:rPr>
       </w:r>
@@ -330,8 +335,8 @@
       </w:pPr>
       <w:r>
         <w:rPr>
-          <w:rFonts w:ascii="Arial" w:cs="Arial" w:eastAsia="Arial" w:hAnsi="Arial"/>
-          <w:sz w:val="20"/>
+          <w:rFonts w:ascii="Times New Roman" w:cs="Times New Roman" w:eastAsia="Arial" w:hAnsi="Times New Roman"/>
+          <w:sz w:val="26"/>
           <w:szCs w:val="20"/>
           <w:rtl w:val="0"/>
         </w:rPr>
@@ -339,6 +344,8 @@
       </w:r>
       <w:r>
         <w:rPr>
+          <w:rFonts w:ascii="Times New Roman" w:hAnsi="Times New Roman" w:cs="Times New Roman"/>
+          <w:sz w:val="26"/>
           <w:rtl w:val="0"/>
         </w:rPr>
       </w:r>
@@ -350,11 +357,11 @@
       </w:pPr>
       <w:r>
         <w:rPr>
-          <w:rFonts w:ascii="Arial" w:cs="Arial" w:eastAsia="Arial" w:hAnsi="Arial"/>
+          <w:rFonts w:ascii="Times New Roman" w:cs="Times New Roman" w:eastAsia="Arial" w:hAnsi="Times New Roman"/>
           <w:b w:val="1"/>
           <w:bCs w:val="1"/>
           <w:color w:val="4f46e5"/>
-          <w:sz w:val="16"/>
+          <w:sz w:val="26"/>
           <w:szCs w:val="16"/>
           <w:rtl w:val="0"/>
         </w:rPr>
@@ -362,6 +369,8 @@
       </w:r>
       <w:r>
         <w:rPr>
+          <w:rFonts w:ascii="Times New Roman" w:hAnsi="Times New Roman" w:cs="Times New Roman"/>
+          <w:sz w:val="26"/>
           <w:rtl w:val="0"/>
         </w:rPr>
       </w:r>
@@ -372,13 +381,17 @@
         <w:rPr/>
       </w:pPr>
       <w:r>
-        <w:t>Tên · value metric · giá công bố · link nguồn.</w:t>
+        <w:rPr>
+          <w:rFonts w:ascii="Times New Roman" w:hAnsi="Times New Roman" w:cs="Times New Roman"/>
+          <w:sz w:val="26"/>
+        </w:rPr>
+        <w:t>Tên · value metric · giá công bố · link nguồn:</w:t>
         <w:br/>
-        <w:t>1. Intercom Fin: Value Metric Outcome-based ($0,99 / resolution; định nghĩa rất chặt: khách xác nhận xong hoặc không hỏi lại, không tính tiền ca escalate sang người hay lỗi kỹ thuật). Nguồn: https://fin.ai/pricing/</w:t>
+        <w:t>1. Intercom Fin: Outcome-based ($0,99 / resolution; tính tiền khi người dùng xác nhận hoặc đóng hội thoại; miễn phí ca chuyển tiếp sang nhân sự). Nguồn: https://fin.ai/pricing/</w:t>
         <w:br/>
-        <w:t>2. Salesforce Agentforce: Value Metric Hybrid ($5/user/tháng + $2,00/conversation hoặc $0,10/action). Nguồn: https://www.salesforce.com/agentforce/pricing/</w:t>
+        <w:t>2. Salesforce Agentforce: Hybrid ($5/user/tháng + $2,00/conversation hoặc $0,10/action qua Flex Credits). Nguồn: https://www.salesforce.com/agentforce/pricing/</w:t>
         <w:br/>
-        <w:t>(Tham chiếu thêm: Zendesk AI for Healthcare: $1,50 / automated resolution. Nguồn: https://support.zendesk.com/hc/en-us/articles/9570369117338-About-automated-resolution-tiers)</w:t>
+        <w:t>3. Zendesk AI for Healthcare (tham chiếu): Outcome-based ($1,50 / automated resolution). Nguồn: https://support.zendesk.com/hc/en-us/articles/9570369117338</w:t>
       </w:r>
     </w:p>
     <w:p>
@@ -391,8 +404,8 @@
       </w:pPr>
       <w:r>
         <w:rPr>
-          <w:rFonts w:ascii="Arial" w:cs="Arial" w:eastAsia="Arial" w:hAnsi="Arial"/>
-          <w:sz w:val="20"/>
+          <w:rFonts w:ascii="Times New Roman" w:cs="Times New Roman" w:eastAsia="Arial" w:hAnsi="Times New Roman"/>
+          <w:sz w:val="26"/>
           <w:szCs w:val="20"/>
           <w:rtl w:val="0"/>
         </w:rPr>
@@ -400,6 +413,8 @@
       </w:r>
       <w:r>
         <w:rPr>
+          <w:rFonts w:ascii="Times New Roman" w:hAnsi="Times New Roman" w:cs="Times New Roman"/>
+          <w:sz w:val="26"/>
           <w:rtl w:val="0"/>
         </w:rPr>
       </w:r>
@@ -414,8 +429,8 @@
       </w:pPr>
       <w:r>
         <w:rPr>
-          <w:rFonts w:ascii="Arial" w:cs="Arial" w:eastAsia="Arial" w:hAnsi="Arial"/>
-          <w:sz w:val="20"/>
+          <w:rFonts w:ascii="Times New Roman" w:cs="Times New Roman" w:eastAsia="Arial" w:hAnsi="Times New Roman"/>
+          <w:sz w:val="26"/>
           <w:szCs w:val="20"/>
           <w:rtl w:val="0"/>
         </w:rPr>
@@ -423,6 +438,8 @@
       </w:r>
       <w:r>
         <w:rPr>
+          <w:rFonts w:ascii="Times New Roman" w:hAnsi="Times New Roman" w:cs="Times New Roman"/>
+          <w:sz w:val="26"/>
           <w:rtl w:val="0"/>
         </w:rPr>
       </w:r>
@@ -434,11 +451,11 @@
       </w:pPr>
       <w:r>
         <w:rPr>
-          <w:rFonts w:ascii="Arial" w:cs="Arial" w:eastAsia="Arial" w:hAnsi="Arial"/>
+          <w:rFonts w:ascii="Times New Roman" w:cs="Times New Roman" w:eastAsia="Arial" w:hAnsi="Times New Roman"/>
           <w:b w:val="1"/>
           <w:bCs w:val="1"/>
           <w:color w:val="4f46e5"/>
-          <w:sz w:val="16"/>
+          <w:sz w:val="26"/>
           <w:szCs w:val="16"/>
           <w:rtl w:val="0"/>
         </w:rPr>
@@ -446,6 +463,8 @@
       </w:r>
       <w:r>
         <w:rPr>
+          <w:rFonts w:ascii="Times New Roman" w:hAnsi="Times New Roman" w:cs="Times New Roman"/>
+          <w:sz w:val="26"/>
           <w:rtl w:val="0"/>
         </w:rPr>
       </w:r>
@@ -500,12 +519,12 @@
             </w:pPr>
             <w:r>
               <w:rPr>
-                <w:rFonts w:ascii="Arial" w:cs="Arial" w:eastAsia="Arial" w:hAnsi="Arial"/>
-                <w:b w:val="1"/>
+                <w:rFonts w:ascii="Times New Roman" w:cs="Times New Roman" w:eastAsia="Arial" w:hAnsi="Times New Roman"/>
+                <w:b/>
                 <w:bCs w:val="1"/>
                 <w:i w:val="0"/>
                 <w:iCs w:val="0"/>
-                <w:sz w:val="18"/>
+                <w:sz w:val="26"/>
                 <w:szCs w:val="18"/>
                 <w:rtl w:val="0"/>
               </w:rPr>
@@ -513,6 +532,9 @@
             </w:r>
             <w:r>
               <w:rPr>
+                <w:rFonts w:ascii="Times New Roman" w:hAnsi="Times New Roman" w:cs="Times New Roman"/>
+                <w:b/>
+                <w:sz w:val="26"/>
                 <w:rtl w:val="0"/>
               </w:rPr>
             </w:r>
@@ -535,12 +557,12 @@
             </w:pPr>
             <w:r>
               <w:rPr>
-                <w:rFonts w:ascii="Arial" w:cs="Arial" w:eastAsia="Arial" w:hAnsi="Arial"/>
-                <w:b w:val="1"/>
+                <w:rFonts w:ascii="Times New Roman" w:cs="Times New Roman" w:eastAsia="Arial" w:hAnsi="Times New Roman"/>
+                <w:b/>
                 <w:bCs w:val="1"/>
                 <w:i w:val="0"/>
                 <w:iCs w:val="0"/>
-                <w:sz w:val="18"/>
+                <w:sz w:val="26"/>
                 <w:szCs w:val="18"/>
                 <w:rtl w:val="0"/>
               </w:rPr>
@@ -548,6 +570,9 @@
             </w:r>
             <w:r>
               <w:rPr>
+                <w:rFonts w:ascii="Times New Roman" w:hAnsi="Times New Roman" w:cs="Times New Roman"/>
+                <w:b/>
+                <w:sz w:val="26"/>
                 <w:rtl w:val="0"/>
               </w:rPr>
             </w:r>
@@ -570,12 +595,12 @@
             </w:pPr>
             <w:r>
               <w:rPr>
-                <w:rFonts w:ascii="Arial" w:cs="Arial" w:eastAsia="Arial" w:hAnsi="Arial"/>
-                <w:b w:val="1"/>
+                <w:rFonts w:ascii="Times New Roman" w:cs="Times New Roman" w:eastAsia="Arial" w:hAnsi="Times New Roman"/>
+                <w:b/>
                 <w:bCs w:val="1"/>
                 <w:i w:val="0"/>
                 <w:iCs w:val="0"/>
-                <w:sz w:val="18"/>
+                <w:sz w:val="26"/>
                 <w:szCs w:val="18"/>
                 <w:rtl w:val="0"/>
               </w:rPr>
@@ -583,6 +608,9 @@
             </w:r>
             <w:r>
               <w:rPr>
+                <w:rFonts w:ascii="Times New Roman" w:hAnsi="Times New Roman" w:cs="Times New Roman"/>
+                <w:b/>
+                <w:sz w:val="26"/>
                 <w:rtl w:val="0"/>
               </w:rPr>
             </w:r>
@@ -610,12 +638,12 @@
             </w:pPr>
             <w:r>
               <w:rPr>
-                <w:rFonts w:ascii="Arial" w:cs="Arial" w:eastAsia="Arial" w:hAnsi="Arial"/>
+                <w:rFonts w:ascii="Times New Roman" w:cs="Times New Roman" w:eastAsia="Arial" w:hAnsi="Times New Roman"/>
                 <w:b w:val="0"/>
                 <w:bCs w:val="0"/>
                 <w:i w:val="0"/>
                 <w:iCs w:val="0"/>
-                <w:sz w:val="18"/>
+                <w:sz w:val="26"/>
                 <w:szCs w:val="18"/>
                 <w:rtl w:val="0"/>
               </w:rPr>
@@ -623,22 +651,30 @@
             </w:r>
             <w:r>
               <w:rPr>
-                <w:rtl w:val="0"/>
-              </w:rPr>
-            </w:r>
-          </w:p>
-        </w:tc>
-        <w:tc>
-          <w:tcPr>
-            <w:tcMar>
-              <w:top w:w="60.0" w:type="dxa"/>
-              <w:left w:w="100.0" w:type="dxa"/>
-              <w:bottom w:w="60.0" w:type="dxa"/>
-              <w:right w:w="100.0" w:type="dxa"/>
-            </w:tcMar>
-          </w:tcPr>
-          <w:p>
-            <w:r>
+                <w:rFonts w:ascii="Times New Roman" w:hAnsi="Times New Roman" w:cs="Times New Roman"/>
+                <w:b w:val="0"/>
+                <w:sz w:val="26"/>
+                <w:rtl w:val="0"/>
+              </w:rPr>
+            </w:r>
+          </w:p>
+        </w:tc>
+        <w:tc>
+          <w:tcPr>
+            <w:tcMar>
+              <w:top w:w="60.0" w:type="dxa"/>
+              <w:left w:w="100.0" w:type="dxa"/>
+              <w:bottom w:w="60.0" w:type="dxa"/>
+              <w:right w:w="100.0" w:type="dxa"/>
+            </w:tcMar>
+          </w:tcPr>
+          <w:p>
+            <w:r>
+              <w:rPr>
+                <w:rFonts w:ascii="Times New Roman" w:hAnsi="Times New Roman" w:cs="Times New Roman"/>
+                <w:b w:val="0"/>
+                <w:sz w:val="26"/>
+              </w:rPr>
               <w:t>$0,227 (5.905 ₫)</w:t>
             </w:r>
           </w:p>
@@ -659,12 +695,12 @@
             </w:pPr>
             <w:r>
               <w:rPr>
-                <w:rFonts w:ascii="Arial" w:cs="Arial" w:eastAsia="Arial" w:hAnsi="Arial"/>
+                <w:rFonts w:ascii="Times New Roman" w:cs="Times New Roman" w:eastAsia="Arial" w:hAnsi="Times New Roman"/>
                 <w:b w:val="0"/>
                 <w:bCs w:val="0"/>
                 <w:i w:val="0"/>
                 <w:iCs w:val="0"/>
-                <w:sz w:val="16"/>
+                <w:sz w:val="26"/>
                 <w:szCs w:val="16"/>
                 <w:rtl w:val="0"/>
               </w:rPr>
@@ -672,6 +708,9 @@
             </w:r>
             <w:r>
               <w:rPr>
+                <w:rFonts w:ascii="Times New Roman" w:hAnsi="Times New Roman" w:cs="Times New Roman"/>
+                <w:b w:val="0"/>
+                <w:sz w:val="26"/>
                 <w:rtl w:val="0"/>
               </w:rPr>
             </w:r>
@@ -699,12 +738,12 @@
             </w:pPr>
             <w:r>
               <w:rPr>
-                <w:rFonts w:ascii="Arial" w:cs="Arial" w:eastAsia="Arial" w:hAnsi="Arial"/>
+                <w:rFonts w:ascii="Times New Roman" w:cs="Times New Roman" w:eastAsia="Arial" w:hAnsi="Times New Roman"/>
                 <w:b w:val="0"/>
                 <w:bCs w:val="0"/>
                 <w:i w:val="0"/>
                 <w:iCs w:val="0"/>
-                <w:sz w:val="18"/>
+                <w:sz w:val="26"/>
                 <w:szCs w:val="18"/>
                 <w:rtl w:val="0"/>
               </w:rPr>
@@ -712,22 +751,30 @@
             </w:r>
             <w:r>
               <w:rPr>
-                <w:rtl w:val="0"/>
-              </w:rPr>
-            </w:r>
-          </w:p>
-        </w:tc>
-        <w:tc>
-          <w:tcPr>
-            <w:tcMar>
-              <w:top w:w="60.0" w:type="dxa"/>
-              <w:left w:w="100.0" w:type="dxa"/>
-              <w:bottom w:w="60.0" w:type="dxa"/>
-              <w:right w:w="100.0" w:type="dxa"/>
-            </w:tcMar>
-          </w:tcPr>
-          <w:p>
-            <w:r>
+                <w:rFonts w:ascii="Times New Roman" w:hAnsi="Times New Roman" w:cs="Times New Roman"/>
+                <w:b w:val="0"/>
+                <w:sz w:val="26"/>
+                <w:rtl w:val="0"/>
+              </w:rPr>
+            </w:r>
+          </w:p>
+        </w:tc>
+        <w:tc>
+          <w:tcPr>
+            <w:tcMar>
+              <w:top w:w="60.0" w:type="dxa"/>
+              <w:left w:w="100.0" w:type="dxa"/>
+              <w:bottom w:w="60.0" w:type="dxa"/>
+              <w:right w:w="100.0" w:type="dxa"/>
+            </w:tcMar>
+          </w:tcPr>
+          <w:p>
+            <w:r>
+              <w:rPr>
+                <w:rFonts w:ascii="Times New Roman" w:hAnsi="Times New Roman" w:cs="Times New Roman"/>
+                <w:b w:val="0"/>
+                <w:sz w:val="26"/>
+              </w:rPr>
               <w:t>$0,681 (17.715 ₫)</w:t>
             </w:r>
           </w:p>
@@ -748,12 +795,12 @@
             </w:pPr>
             <w:r>
               <w:rPr>
-                <w:rFonts w:ascii="Arial" w:cs="Arial" w:eastAsia="Arial" w:hAnsi="Arial"/>
+                <w:rFonts w:ascii="Times New Roman" w:cs="Times New Roman" w:eastAsia="Arial" w:hAnsi="Times New Roman"/>
                 <w:b w:val="0"/>
                 <w:bCs w:val="0"/>
                 <w:i w:val="0"/>
                 <w:iCs w:val="0"/>
-                <w:sz w:val="16"/>
+                <w:sz w:val="26"/>
                 <w:szCs w:val="16"/>
                 <w:rtl w:val="0"/>
               </w:rPr>
@@ -761,6 +808,9 @@
             </w:r>
             <w:r>
               <w:rPr>
+                <w:rFonts w:ascii="Times New Roman" w:hAnsi="Times New Roman" w:cs="Times New Roman"/>
+                <w:b w:val="0"/>
+                <w:sz w:val="26"/>
                 <w:rtl w:val="0"/>
               </w:rPr>
             </w:r>
@@ -788,12 +838,12 @@
             </w:pPr>
             <w:r>
               <w:rPr>
-                <w:rFonts w:ascii="Arial" w:cs="Arial" w:eastAsia="Arial" w:hAnsi="Arial"/>
+                <w:rFonts w:ascii="Times New Roman" w:cs="Times New Roman" w:eastAsia="Arial" w:hAnsi="Times New Roman"/>
                 <w:b w:val="0"/>
                 <w:bCs w:val="0"/>
                 <w:i w:val="0"/>
                 <w:iCs w:val="0"/>
-                <w:sz w:val="18"/>
+                <w:sz w:val="26"/>
                 <w:szCs w:val="18"/>
                 <w:rtl w:val="0"/>
               </w:rPr>
@@ -801,22 +851,30 @@
             </w:r>
             <w:r>
               <w:rPr>
-                <w:rtl w:val="0"/>
-              </w:rPr>
-            </w:r>
-          </w:p>
-        </w:tc>
-        <w:tc>
-          <w:tcPr>
-            <w:tcMar>
-              <w:top w:w="60.0" w:type="dxa"/>
-              <w:left w:w="100.0" w:type="dxa"/>
-              <w:bottom w:w="60.0" w:type="dxa"/>
-              <w:right w:w="100.0" w:type="dxa"/>
-            </w:tcMar>
-          </w:tcPr>
-          <w:p>
-            <w:r>
+                <w:rFonts w:ascii="Times New Roman" w:hAnsi="Times New Roman" w:cs="Times New Roman"/>
+                <w:b w:val="0"/>
+                <w:sz w:val="26"/>
+                <w:rtl w:val="0"/>
+              </w:rPr>
+            </w:r>
+          </w:p>
+        </w:tc>
+        <w:tc>
+          <w:tcPr>
+            <w:tcMar>
+              <w:top w:w="60.0" w:type="dxa"/>
+              <w:left w:w="100.0" w:type="dxa"/>
+              <w:bottom w:w="60.0" w:type="dxa"/>
+              <w:right w:w="100.0" w:type="dxa"/>
+            </w:tcMar>
+          </w:tcPr>
+          <w:p>
+            <w:r>
+              <w:rPr>
+                <w:rFonts w:ascii="Times New Roman" w:hAnsi="Times New Roman" w:cs="Times New Roman"/>
+                <w:b w:val="0"/>
+                <w:sz w:val="26"/>
+              </w:rPr>
               <w:t>$0,790 (20.540 ₫)</w:t>
             </w:r>
           </w:p>
@@ -837,12 +895,12 @@
             </w:pPr>
             <w:r>
               <w:rPr>
-                <w:rFonts w:ascii="Arial" w:cs="Arial" w:eastAsia="Arial" w:hAnsi="Arial"/>
+                <w:rFonts w:ascii="Times New Roman" w:cs="Times New Roman" w:eastAsia="Arial" w:hAnsi="Times New Roman"/>
                 <w:b w:val="0"/>
                 <w:bCs w:val="0"/>
                 <w:i w:val="0"/>
                 <w:iCs w:val="0"/>
-                <w:sz w:val="16"/>
+                <w:sz w:val="26"/>
                 <w:szCs w:val="16"/>
                 <w:rtl w:val="0"/>
               </w:rPr>
@@ -850,6 +908,9 @@
             </w:r>
             <w:r>
               <w:rPr>
+                <w:rFonts w:ascii="Times New Roman" w:hAnsi="Times New Roman" w:cs="Times New Roman"/>
+                <w:b w:val="0"/>
+                <w:sz w:val="26"/>
                 <w:rtl w:val="0"/>
               </w:rPr>
             </w:r>
@@ -877,12 +938,12 @@
             </w:pPr>
             <w:r>
               <w:rPr>
-                <w:rFonts w:ascii="Arial" w:cs="Arial" w:eastAsia="Arial" w:hAnsi="Arial"/>
+                <w:rFonts w:ascii="Times New Roman" w:cs="Times New Roman" w:eastAsia="Arial" w:hAnsi="Times New Roman"/>
                 <w:b w:val="0"/>
                 <w:bCs w:val="0"/>
                 <w:i w:val="0"/>
                 <w:iCs w:val="0"/>
-                <w:sz w:val="18"/>
+                <w:sz w:val="26"/>
                 <w:szCs w:val="18"/>
                 <w:rtl w:val="0"/>
               </w:rPr>
@@ -890,22 +951,30 @@
             </w:r>
             <w:r>
               <w:rPr>
-                <w:rtl w:val="0"/>
-              </w:rPr>
-            </w:r>
-          </w:p>
-        </w:tc>
-        <w:tc>
-          <w:tcPr>
-            <w:tcMar>
-              <w:top w:w="60.0" w:type="dxa"/>
-              <w:left w:w="100.0" w:type="dxa"/>
-              <w:bottom w:w="60.0" w:type="dxa"/>
-              <w:right w:w="100.0" w:type="dxa"/>
-            </w:tcMar>
-          </w:tcPr>
-          <w:p>
-            <w:r>
+                <w:rFonts w:ascii="Times New Roman" w:hAnsi="Times New Roman" w:cs="Times New Roman"/>
+                <w:b w:val="0"/>
+                <w:sz w:val="26"/>
+                <w:rtl w:val="0"/>
+              </w:rPr>
+            </w:r>
+          </w:p>
+        </w:tc>
+        <w:tc>
+          <w:tcPr>
+            <w:tcMar>
+              <w:top w:w="60.0" w:type="dxa"/>
+              <w:left w:w="100.0" w:type="dxa"/>
+              <w:bottom w:w="60.0" w:type="dxa"/>
+              <w:right w:w="100.0" w:type="dxa"/>
+            </w:tcMar>
+          </w:tcPr>
+          <w:p>
+            <w:r>
+              <w:rPr>
+                <w:rFonts w:ascii="Times New Roman" w:hAnsi="Times New Roman" w:cs="Times New Roman"/>
+                <w:b w:val="0"/>
+                <w:sz w:val="26"/>
+              </w:rPr>
               <w:t>71,25%</w:t>
             </w:r>
           </w:p>
@@ -926,12 +995,12 @@
             </w:pPr>
             <w:r>
               <w:rPr>
-                <w:rFonts w:ascii="Arial" w:cs="Arial" w:eastAsia="Arial" w:hAnsi="Arial"/>
+                <w:rFonts w:ascii="Times New Roman" w:cs="Times New Roman" w:eastAsia="Arial" w:hAnsi="Times New Roman"/>
                 <w:b w:val="0"/>
                 <w:bCs w:val="0"/>
                 <w:i w:val="0"/>
                 <w:iCs w:val="0"/>
-                <w:sz w:val="16"/>
+                <w:sz w:val="26"/>
                 <w:szCs w:val="16"/>
                 <w:rtl w:val="0"/>
               </w:rPr>
@@ -939,6 +1008,9 @@
             </w:r>
             <w:r>
               <w:rPr>
+                <w:rFonts w:ascii="Times New Roman" w:hAnsi="Times New Roman" w:cs="Times New Roman"/>
+                <w:b w:val="0"/>
+                <w:sz w:val="26"/>
                 <w:rtl w:val="0"/>
               </w:rPr>
             </w:r>
@@ -966,12 +1038,12 @@
             </w:pPr>
             <w:r>
               <w:rPr>
-                <w:rFonts w:ascii="Arial" w:cs="Arial" w:eastAsia="Arial" w:hAnsi="Arial"/>
+                <w:rFonts w:ascii="Times New Roman" w:cs="Times New Roman" w:eastAsia="Arial" w:hAnsi="Times New Roman"/>
                 <w:b w:val="0"/>
                 <w:bCs w:val="0"/>
                 <w:i w:val="0"/>
                 <w:iCs w:val="0"/>
-                <w:sz w:val="18"/>
+                <w:sz w:val="26"/>
                 <w:szCs w:val="18"/>
                 <w:rtl w:val="0"/>
               </w:rPr>
@@ -979,22 +1051,30 @@
             </w:r>
             <w:r>
               <w:rPr>
-                <w:rtl w:val="0"/>
-              </w:rPr>
-            </w:r>
-          </w:p>
-        </w:tc>
-        <w:tc>
-          <w:tcPr>
-            <w:tcMar>
-              <w:top w:w="60.0" w:type="dxa"/>
-              <w:left w:w="100.0" w:type="dxa"/>
-              <w:bottom w:w="60.0" w:type="dxa"/>
-              <w:right w:w="100.0" w:type="dxa"/>
-            </w:tcMar>
-          </w:tcPr>
-          <w:p>
-            <w:r>
+                <w:rFonts w:ascii="Times New Roman" w:hAnsi="Times New Roman" w:cs="Times New Roman"/>
+                <w:b w:val="0"/>
+                <w:sz w:val="26"/>
+                <w:rtl w:val="0"/>
+              </w:rPr>
+            </w:r>
+          </w:p>
+        </w:tc>
+        <w:tc>
+          <w:tcPr>
+            <w:tcMar>
+              <w:top w:w="60.0" w:type="dxa"/>
+              <w:left w:w="100.0" w:type="dxa"/>
+              <w:bottom w:w="60.0" w:type="dxa"/>
+              <w:right w:w="100.0" w:type="dxa"/>
+            </w:tcMar>
+          </w:tcPr>
+          <w:p>
+            <w:r>
+              <w:rPr>
+                <w:rFonts w:ascii="Times New Roman" w:hAnsi="Times New Roman" w:cs="Times New Roman"/>
+                <w:b w:val="0"/>
+                <w:sz w:val="26"/>
+              </w:rPr>
               <w:t>70,29%</w:t>
             </w:r>
           </w:p>
@@ -1015,12 +1095,12 @@
             </w:pPr>
             <w:r>
               <w:rPr>
-                <w:rFonts w:ascii="Arial" w:cs="Arial" w:eastAsia="Arial" w:hAnsi="Arial"/>
+                <w:rFonts w:ascii="Times New Roman" w:cs="Times New Roman" w:eastAsia="Arial" w:hAnsi="Times New Roman"/>
                 <w:b w:val="0"/>
                 <w:bCs w:val="0"/>
                 <w:i w:val="0"/>
                 <w:iCs w:val="0"/>
-                <w:sz w:val="16"/>
+                <w:sz w:val="26"/>
                 <w:szCs w:val="16"/>
                 <w:rtl w:val="0"/>
               </w:rPr>
@@ -1028,6 +1108,9 @@
             </w:r>
             <w:r>
               <w:rPr>
+                <w:rFonts w:ascii="Times New Roman" w:hAnsi="Times New Roman" w:cs="Times New Roman"/>
+                <w:b w:val="0"/>
+                <w:sz w:val="26"/>
                 <w:rtl w:val="0"/>
               </w:rPr>
             </w:r>
@@ -1055,12 +1138,12 @@
             </w:pPr>
             <w:r>
               <w:rPr>
-                <w:rFonts w:ascii="Arial" w:cs="Arial" w:eastAsia="Arial" w:hAnsi="Arial"/>
+                <w:rFonts w:ascii="Times New Roman" w:cs="Times New Roman" w:eastAsia="Arial" w:hAnsi="Times New Roman"/>
                 <w:b w:val="0"/>
                 <w:bCs w:val="0"/>
                 <w:i w:val="0"/>
                 <w:iCs w:val="0"/>
-                <w:sz w:val="18"/>
+                <w:sz w:val="26"/>
                 <w:szCs w:val="18"/>
                 <w:rtl w:val="0"/>
               </w:rPr>
@@ -1068,22 +1151,30 @@
             </w:r>
             <w:r>
               <w:rPr>
-                <w:rtl w:val="0"/>
-              </w:rPr>
-            </w:r>
-          </w:p>
-        </w:tc>
-        <w:tc>
-          <w:tcPr>
-            <w:tcMar>
-              <w:top w:w="60.0" w:type="dxa"/>
-              <w:left w:w="100.0" w:type="dxa"/>
-              <w:bottom w:w="60.0" w:type="dxa"/>
-              <w:right w:w="100.0" w:type="dxa"/>
-            </w:tcMar>
-          </w:tcPr>
-          <w:p>
-            <w:r>
+                <w:rFonts w:ascii="Times New Roman" w:hAnsi="Times New Roman" w:cs="Times New Roman"/>
+                <w:b w:val="0"/>
+                <w:sz w:val="26"/>
+                <w:rtl w:val="0"/>
+              </w:rPr>
+            </w:r>
+          </w:p>
+        </w:tc>
+        <w:tc>
+          <w:tcPr>
+            <w:tcMar>
+              <w:top w:w="60.0" w:type="dxa"/>
+              <w:left w:w="100.0" w:type="dxa"/>
+              <w:bottom w:w="60.0" w:type="dxa"/>
+              <w:right w:w="100.0" w:type="dxa"/>
+            </w:tcMar>
+          </w:tcPr>
+          <w:p>
+            <w:r>
+              <w:rPr>
+                <w:rFonts w:ascii="Times New Roman" w:hAnsi="Times New Roman" w:cs="Times New Roman"/>
+                <w:b w:val="0"/>
+                <w:sz w:val="26"/>
+              </w:rPr>
               <w:t>78,00%</w:t>
             </w:r>
           </w:p>
@@ -1104,12 +1195,12 @@
             </w:pPr>
             <w:r>
               <w:rPr>
-                <w:rFonts w:ascii="Arial" w:cs="Arial" w:eastAsia="Arial" w:hAnsi="Arial"/>
+                <w:rFonts w:ascii="Times New Roman" w:cs="Times New Roman" w:eastAsia="Arial" w:hAnsi="Times New Roman"/>
                 <w:b w:val="0"/>
                 <w:bCs w:val="0"/>
                 <w:i w:val="0"/>
                 <w:iCs w:val="0"/>
-                <w:sz w:val="16"/>
+                <w:sz w:val="26"/>
                 <w:szCs w:val="16"/>
                 <w:rtl w:val="0"/>
               </w:rPr>
@@ -1117,6 +1208,9 @@
             </w:r>
             <w:r>
               <w:rPr>
+                <w:rFonts w:ascii="Times New Roman" w:hAnsi="Times New Roman" w:cs="Times New Roman"/>
+                <w:b w:val="0"/>
+                <w:sz w:val="26"/>
                 <w:rtl w:val="0"/>
               </w:rPr>
             </w:r>
@@ -1131,6 +1225,8 @@
       </w:pPr>
       <w:r>
         <w:rPr>
+          <w:rFonts w:ascii="Times New Roman" w:hAnsi="Times New Roman" w:cs="Times New Roman"/>
+          <w:sz w:val="26"/>
           <w:rtl w:val="0"/>
         </w:rPr>
       </w:r>
@@ -1142,11 +1238,11 @@
       </w:pPr>
       <w:r>
         <w:rPr>
-          <w:rFonts w:ascii="Arial" w:cs="Arial" w:eastAsia="Arial" w:hAnsi="Arial"/>
+          <w:rFonts w:ascii="Times New Roman" w:cs="Times New Roman" w:eastAsia="Arial" w:hAnsi="Times New Roman"/>
           <w:b w:val="1"/>
           <w:bCs w:val="1"/>
           <w:color w:val="4f46e5"/>
-          <w:sz w:val="16"/>
+          <w:sz w:val="26"/>
           <w:szCs w:val="16"/>
           <w:rtl w:val="0"/>
         </w:rPr>
@@ -1154,6 +1250,8 @@
       </w:r>
       <w:r>
         <w:rPr>
+          <w:rFonts w:ascii="Times New Roman" w:hAnsi="Times New Roman" w:cs="Times New Roman"/>
+          <w:sz w:val="26"/>
           <w:rtl w:val="0"/>
         </w:rPr>
       </w:r>
@@ -1164,9 +1262,13 @@
         <w:rPr/>
       </w:pPr>
       <w:r>
+        <w:rPr>
+          <w:rFonts w:ascii="Times New Roman" w:hAnsi="Times New Roman" w:cs="Times New Roman"/>
+          <w:sz w:val="26"/>
+        </w:rPr>
         <w:t>Neo theo giá trị tạo ra (10–25%) hay theo lương vị trí bị thay (50–70%)? Vì sao khách sẽ chấp nhận cách neo đó?</w:t>
         <w:br/>
-        <w:t>→ Neo kết hợp giữa 10–25% giá trị tạo ra và 50–70% chi phí nhân sự thay thế: Một cơ sở y tế xử lý 1.000 ca triage/tháng tiết kiệm được ~133 giờ làm việc của điều dưỡng trực sơ loại (tương đương ~$930 chi phí nhân công) và giải phóng 35% áp lực quá tải phòng chờ cấp cứu (tạo giá trị chuyển đổi khám đúng chuyên khoa trị giá ~$4.500/tháng). Giá bán $0,79/ca (tương đương $790/tháng) chỉ chiếm 17,5% tổng giá trị tạo ra ($4.500) và rẻ hơn 35% so với thuê 1 điều dưỡng trực đêm chuyên trách ($1.200/tháng). Khách hàng Vinmec dễ dàng phê duyệt vì ROI &gt; 5x có thể đo lường trực tiếp ngay tháng đầu tiên.</w:t>
+        <w:t>Trả lời: Neo kết hợp giữa 10–25% giá trị tạo ra và 50–70% chi phí nhân sự thay thế: Một cơ sở xử lý 1.000 ca triage/tháng tiết kiệm ~133 giờ trực của điều dưỡng (~$930 chi phí nhân công) và giải phóng phòng khám cấp cứu, tạo giá trị chuyển đổi đặt khám đúng chuyên khoa trị giá ~$4.500/tháng. Mức phí $0,79/ca (tương đương $790/tháng) chiếm 17,5% giá trị tạo ra và thấp hơn 34% so với chi phí thuê 1 nhân sự trực hotline ($1.200/tháng), đảm bảo tính thuyết phục khi xét duyệt ngân sách.</w:t>
       </w:r>
     </w:p>
     <w:p>
@@ -1179,8 +1281,8 @@
       </w:pPr>
       <w:r>
         <w:rPr>
-          <w:rFonts w:ascii="Arial" w:cs="Arial" w:eastAsia="Arial" w:hAnsi="Arial"/>
-          <w:sz w:val="20"/>
+          <w:rFonts w:ascii="Times New Roman" w:cs="Times New Roman" w:eastAsia="Arial" w:hAnsi="Times New Roman"/>
+          <w:sz w:val="26"/>
           <w:szCs w:val="20"/>
           <w:rtl w:val="0"/>
         </w:rPr>
@@ -1188,6 +1290,8 @@
       </w:r>
       <w:r>
         <w:rPr>
+          <w:rFonts w:ascii="Times New Roman" w:hAnsi="Times New Roman" w:cs="Times New Roman"/>
+          <w:sz w:val="26"/>
           <w:rtl w:val="0"/>
         </w:rPr>
       </w:r>
@@ -1202,8 +1306,8 @@
       </w:pPr>
       <w:r>
         <w:rPr>
-          <w:rFonts w:ascii="Arial" w:cs="Arial" w:eastAsia="Arial" w:hAnsi="Arial"/>
-          <w:sz w:val="20"/>
+          <w:rFonts w:ascii="Times New Roman" w:cs="Times New Roman" w:eastAsia="Arial" w:hAnsi="Times New Roman"/>
+          <w:sz w:val="26"/>
           <w:szCs w:val="20"/>
           <w:rtl w:val="0"/>
         </w:rPr>
@@ -1211,6 +1315,8 @@
       </w:r>
       <w:r>
         <w:rPr>
+          <w:rFonts w:ascii="Times New Roman" w:hAnsi="Times New Roman" w:cs="Times New Roman"/>
+          <w:sz w:val="26"/>
           <w:rtl w:val="0"/>
         </w:rPr>
       </w:r>
@@ -1222,11 +1328,11 @@
       </w:pPr>
       <w:r>
         <w:rPr>
-          <w:rFonts w:ascii="Arial" w:cs="Arial" w:eastAsia="Arial" w:hAnsi="Arial"/>
+          <w:rFonts w:ascii="Times New Roman" w:cs="Times New Roman" w:eastAsia="Arial" w:hAnsi="Times New Roman"/>
           <w:b w:val="1"/>
           <w:bCs w:val="1"/>
           <w:color w:val="4f46e5"/>
-          <w:sz w:val="16"/>
+          <w:sz w:val="26"/>
           <w:szCs w:val="16"/>
           <w:rtl w:val="0"/>
         </w:rPr>
@@ -1234,6 +1340,8 @@
       </w:r>
       <w:r>
         <w:rPr>
+          <w:rFonts w:ascii="Times New Roman" w:hAnsi="Times New Roman" w:cs="Times New Roman"/>
+          <w:sz w:val="26"/>
           <w:rtl w:val="0"/>
         </w:rPr>
       </w:r>
@@ -1244,9 +1352,13 @@
         <w:rPr/>
       </w:pPr>
       <w:r>
+        <w:rPr>
+          <w:rFonts w:ascii="Times New Roman" w:hAnsi="Times New Roman" w:cs="Times New Roman"/>
+          <w:sz w:val="26"/>
+        </w:rPr>
         <w:t>Một câu: biến nào, vượt ngưỡng nào, thì Gross Margin tụt dưới 50%?</w:t>
         <w:br/>
-        <w:t>→ Mô hình gãy (Gross Margin tụt dưới 50%) khi tỷ lệ Containment tụt xuống dưới 63,4% (AI làm sai hoặc nghi ngờ quá nhiều dẫn tới trên 36,6% ca phải chuyển sang điều dưỡng trực với chi phí nhân sự $7/giờ) hoặc khi chi phí LLM tăng đột biến do không kích hoạt được Prompt Caching (cắt giảm 38,8% chi phí token).</w:t>
+        <w:t>Trả lời: Mô hình giảm Gross Margin xuống dưới 50% khi tỷ lệ Containment giảm xuống dưới 63,4% (trên 36,6% ca phải chuyển tiếp sang điều dưỡng với chi phí nhân sự $7/giờ) hoặc khi chi phí LLM tăng do mất tính năng Prompt Caching (đang tiết kiệm 38,8% chi phí token).</w:t>
       </w:r>
     </w:p>
     <w:p>
@@ -1259,8 +1371,8 @@
       </w:pPr>
       <w:r>
         <w:rPr>
-          <w:rFonts w:ascii="Arial" w:cs="Arial" w:eastAsia="Arial" w:hAnsi="Arial"/>
-          <w:sz w:val="20"/>
+          <w:rFonts w:ascii="Times New Roman" w:cs="Times New Roman" w:eastAsia="Arial" w:hAnsi="Times New Roman"/>
+          <w:sz w:val="26"/>
           <w:szCs w:val="20"/>
           <w:rtl w:val="0"/>
         </w:rPr>
@@ -1268,16 +1380,20 @@
       </w:r>
       <w:r>
         <w:rPr>
-          <w:rtl w:val="0"/>
-        </w:rPr>
-      </w:r>
-    </w:p>
-    <w:p>
-      <w:pPr>
-        <w:rPr/>
-      </w:pPr>
-      <w:r>
-        <w:rPr>
+          <w:rFonts w:ascii="Times New Roman" w:hAnsi="Times New Roman" w:cs="Times New Roman"/>
+          <w:sz w:val="26"/>
+          <w:rtl w:val="0"/>
+        </w:rPr>
+      </w:r>
+    </w:p>
+    <w:p>
+      <w:pPr>
+        <w:rPr/>
+      </w:pPr>
+      <w:r>
+        <w:rPr>
+          <w:rFonts w:ascii="Times New Roman" w:hAnsi="Times New Roman" w:cs="Times New Roman"/>
+          <w:sz w:val="26"/>
           <w:rtl w:val="0"/>
         </w:rPr>
         <w:br w:type="textWrapping"/>
@@ -1290,34 +1406,37 @@
       </w:pPr>
       <w:r>
         <w:rPr>
-          <w:rFonts w:ascii="Arial" w:cs="Arial" w:eastAsia="Arial" w:hAnsi="Arial"/>
+          <w:rFonts w:ascii="Times New Roman" w:cs="Times New Roman" w:eastAsia="Arial" w:hAnsi="Times New Roman"/>
+          <w:b/>
+          <w:bCs w:val="1"/>
+          <w:color w:val="4f46e5"/>
+          <w:sz w:val="28"/>
+          <w:szCs w:val="24"/>
+          <w:rtl w:val="0"/>
+        </w:rPr>
+        <w:t xml:space="preserve">2 · GO-TO-MARKET</w:t>
+      </w:r>
+      <w:r>
+        <w:rPr>
+          <w:rFonts w:ascii="Times New Roman" w:hAnsi="Times New Roman" w:cs="Times New Roman"/>
+          <w:b/>
+          <w:sz w:val="28"/>
+          <w:rtl w:val="0"/>
+        </w:rPr>
+      </w:r>
+    </w:p>
+    <w:p>
+      <w:pPr>
+        <w:spacing w:after="40" w:before="0" w:lineRule="auto"/>
+        <w:rPr/>
+      </w:pPr>
+      <w:r>
+        <w:rPr>
+          <w:rFonts w:ascii="Times New Roman" w:cs="Times New Roman" w:eastAsia="Arial" w:hAnsi="Times New Roman"/>
           <w:b w:val="1"/>
           <w:bCs w:val="1"/>
           <w:color w:val="4f46e5"/>
-          <w:sz w:val="24"/>
-          <w:szCs w:val="24"/>
-          <w:rtl w:val="0"/>
-        </w:rPr>
-        <w:t xml:space="preserve">2 · GO-TO-MARKET</w:t>
-      </w:r>
-      <w:r>
-        <w:rPr>
-          <w:rtl w:val="0"/>
-        </w:rPr>
-      </w:r>
-    </w:p>
-    <w:p>
-      <w:pPr>
-        <w:spacing w:after="40" w:before="0" w:lineRule="auto"/>
-        <w:rPr/>
-      </w:pPr>
-      <w:r>
-        <w:rPr>
-          <w:rFonts w:ascii="Arial" w:cs="Arial" w:eastAsia="Arial" w:hAnsi="Arial"/>
-          <w:b w:val="1"/>
-          <w:bCs w:val="1"/>
-          <w:color w:val="4f46e5"/>
-          <w:sz w:val="16"/>
+          <w:sz w:val="26"/>
           <w:szCs w:val="16"/>
           <w:rtl w:val="0"/>
         </w:rPr>
@@ -1325,6 +1444,8 @@
       </w:r>
       <w:r>
         <w:rPr>
+          <w:rFonts w:ascii="Times New Roman" w:hAnsi="Times New Roman" w:cs="Times New Roman"/>
+          <w:sz w:val="26"/>
           <w:rtl w:val="0"/>
         </w:rPr>
       </w:r>
@@ -1335,9 +1456,13 @@
         <w:rPr/>
       </w:pPr>
       <w:r>
+        <w:rPr>
+          <w:rFonts w:ascii="Times New Roman" w:hAnsi="Times New Roman" w:cs="Times New Roman"/>
+          <w:sz w:val="26"/>
+        </w:rPr>
         <w:t>PLG / Sales-Led / Partner-Led. Nếu Partner-Led: TÊN CÔNG TY cụ thể + đã nói chuyện chưa + bạn mang lại giá trị gì cho họ.</w:t>
         <w:br/>
-        <w:t>→ Chọn Partner-Led: Đối tác Hệ thống Y tế Vinmec (Vinmec Healthcare System). Đã kết nối và trao đổi trong khuôn khổ chương trình đổi mới sáng tạo y tế thông minh. Giá trị mang lại cho Vinmec: Tự động hóa tiếp nhận &amp; phân tầng bệnh nhân 24/7, giảm 80% thời gian chờ đợi tại khoa khám bệnh (từ 15 phút xuống 2 phút), chấm dứt tình trạng quá tải điều dưỡng trực hotline ban đêm, đồng thời tăng 25% tỷ lệ bệnh nhân đặt lịch đúng chuyên khoa ngay từ lần đầu.</w:t>
+        <w:t>Trả lời: Kênh Partner-Led qua Hệ thống Y tế Vinmec. Trạng thái: Đã kết nối trong chương trình chuyển đổi số y tế. Giá trị mang lại: Tự động hóa tiếp nhận 24/7, giảm thời gian chờ đợi tại quầy tiếp đón từ 15 phút xuống 2 phút, giảm tải tổng đài trực đêm và nâng tỷ lệ đặt khám đúng chuyên khoa thêm 25%.</w:t>
       </w:r>
     </w:p>
     <w:p>
@@ -1350,8 +1475,8 @@
       </w:pPr>
       <w:r>
         <w:rPr>
-          <w:rFonts w:ascii="Arial" w:cs="Arial" w:eastAsia="Arial" w:hAnsi="Arial"/>
-          <w:sz w:val="20"/>
+          <w:rFonts w:ascii="Times New Roman" w:cs="Times New Roman" w:eastAsia="Arial" w:hAnsi="Times New Roman"/>
+          <w:sz w:val="26"/>
           <w:szCs w:val="20"/>
           <w:rtl w:val="0"/>
         </w:rPr>
@@ -1359,6 +1484,8 @@
       </w:r>
       <w:r>
         <w:rPr>
+          <w:rFonts w:ascii="Times New Roman" w:hAnsi="Times New Roman" w:cs="Times New Roman"/>
+          <w:sz w:val="26"/>
           <w:rtl w:val="0"/>
         </w:rPr>
       </w:r>
@@ -1373,8 +1500,8 @@
       </w:pPr>
       <w:r>
         <w:rPr>
-          <w:rFonts w:ascii="Arial" w:cs="Arial" w:eastAsia="Arial" w:hAnsi="Arial"/>
-          <w:sz w:val="20"/>
+          <w:rFonts w:ascii="Times New Roman" w:cs="Times New Roman" w:eastAsia="Arial" w:hAnsi="Times New Roman"/>
+          <w:sz w:val="26"/>
           <w:szCs w:val="20"/>
           <w:rtl w:val="0"/>
         </w:rPr>
@@ -1382,6 +1509,8 @@
       </w:r>
       <w:r>
         <w:rPr>
+          <w:rFonts w:ascii="Times New Roman" w:hAnsi="Times New Roman" w:cs="Times New Roman"/>
+          <w:sz w:val="26"/>
           <w:rtl w:val="0"/>
         </w:rPr>
       </w:r>
@@ -1393,11 +1522,11 @@
       </w:pPr>
       <w:r>
         <w:rPr>
-          <w:rFonts w:ascii="Arial" w:cs="Arial" w:eastAsia="Arial" w:hAnsi="Arial"/>
+          <w:rFonts w:ascii="Times New Roman" w:cs="Times New Roman" w:eastAsia="Arial" w:hAnsi="Times New Roman"/>
           <w:b w:val="1"/>
           <w:bCs w:val="1"/>
           <w:color w:val="4f46e5"/>
-          <w:sz w:val="16"/>
+          <w:sz w:val="26"/>
           <w:szCs w:val="16"/>
           <w:rtl w:val="0"/>
         </w:rPr>
@@ -1405,6 +1534,8 @@
       </w:r>
       <w:r>
         <w:rPr>
+          <w:rFonts w:ascii="Times New Roman" w:hAnsi="Times New Roman" w:cs="Times New Roman"/>
+          <w:sz w:val="26"/>
           <w:rtl w:val="0"/>
         </w:rPr>
       </w:r>
@@ -1459,12 +1590,12 @@
             </w:pPr>
             <w:r>
               <w:rPr>
-                <w:rFonts w:ascii="Arial" w:cs="Arial" w:eastAsia="Arial" w:hAnsi="Arial"/>
-                <w:b w:val="1"/>
+                <w:rFonts w:ascii="Times New Roman" w:cs="Times New Roman" w:eastAsia="Arial" w:hAnsi="Times New Roman"/>
+                <w:b/>
                 <w:bCs w:val="1"/>
                 <w:i w:val="0"/>
                 <w:iCs w:val="0"/>
-                <w:sz w:val="18"/>
+                <w:sz w:val="26"/>
                 <w:szCs w:val="18"/>
                 <w:rtl w:val="0"/>
               </w:rPr>
@@ -1472,6 +1603,9 @@
             </w:r>
             <w:r>
               <w:rPr>
+                <w:rFonts w:ascii="Times New Roman" w:hAnsi="Times New Roman" w:cs="Times New Roman"/>
+                <w:b/>
+                <w:sz w:val="26"/>
                 <w:rtl w:val="0"/>
               </w:rPr>
             </w:r>
@@ -1494,12 +1628,12 @@
             </w:pPr>
             <w:r>
               <w:rPr>
-                <w:rFonts w:ascii="Arial" w:cs="Arial" w:eastAsia="Arial" w:hAnsi="Arial"/>
-                <w:b w:val="1"/>
+                <w:rFonts w:ascii="Times New Roman" w:cs="Times New Roman" w:eastAsia="Arial" w:hAnsi="Times New Roman"/>
+                <w:b/>
                 <w:bCs w:val="1"/>
                 <w:i w:val="0"/>
                 <w:iCs w:val="0"/>
-                <w:sz w:val="18"/>
+                <w:sz w:val="26"/>
                 <w:szCs w:val="18"/>
                 <w:rtl w:val="0"/>
               </w:rPr>
@@ -1507,6 +1641,9 @@
             </w:r>
             <w:r>
               <w:rPr>
+                <w:rFonts w:ascii="Times New Roman" w:hAnsi="Times New Roman" w:cs="Times New Roman"/>
+                <w:b/>
+                <w:sz w:val="26"/>
                 <w:rtl w:val="0"/>
               </w:rPr>
             </w:r>
@@ -1529,12 +1666,12 @@
             </w:pPr>
             <w:r>
               <w:rPr>
-                <w:rFonts w:ascii="Arial" w:cs="Arial" w:eastAsia="Arial" w:hAnsi="Arial"/>
-                <w:b w:val="1"/>
+                <w:rFonts w:ascii="Times New Roman" w:cs="Times New Roman" w:eastAsia="Arial" w:hAnsi="Times New Roman"/>
+                <w:b/>
                 <w:bCs w:val="1"/>
                 <w:i w:val="0"/>
                 <w:iCs w:val="0"/>
-                <w:sz w:val="18"/>
+                <w:sz w:val="26"/>
                 <w:szCs w:val="18"/>
                 <w:rtl w:val="0"/>
               </w:rPr>
@@ -1542,6 +1679,9 @@
             </w:r>
             <w:r>
               <w:rPr>
+                <w:rFonts w:ascii="Times New Roman" w:hAnsi="Times New Roman" w:cs="Times New Roman"/>
+                <w:b/>
+                <w:sz w:val="26"/>
                 <w:rtl w:val="0"/>
               </w:rPr>
             </w:r>
@@ -1569,12 +1709,12 @@
             </w:pPr>
             <w:r>
               <w:rPr>
-                <w:rFonts w:ascii="Arial" w:cs="Arial" w:eastAsia="Arial" w:hAnsi="Arial"/>
+                <w:rFonts w:ascii="Times New Roman" w:cs="Times New Roman" w:eastAsia="Arial" w:hAnsi="Times New Roman"/>
                 <w:b w:val="0"/>
                 <w:bCs w:val="0"/>
                 <w:i w:val="0"/>
                 <w:iCs w:val="0"/>
-                <w:sz w:val="18"/>
+                <w:sz w:val="26"/>
                 <w:szCs w:val="18"/>
                 <w:rtl w:val="0"/>
               </w:rPr>
@@ -1582,22 +1722,30 @@
             </w:r>
             <w:r>
               <w:rPr>
-                <w:rtl w:val="0"/>
-              </w:rPr>
-            </w:r>
-          </w:p>
-        </w:tc>
-        <w:tc>
-          <w:tcPr>
-            <w:tcMar>
-              <w:top w:w="60.0" w:type="dxa"/>
-              <w:left w:w="100.0" w:type="dxa"/>
-              <w:bottom w:w="60.0" w:type="dxa"/>
-              <w:right w:w="100.0" w:type="dxa"/>
-            </w:tcMar>
-          </w:tcPr>
-          <w:p>
-            <w:r>
+                <w:rFonts w:ascii="Times New Roman" w:hAnsi="Times New Roman" w:cs="Times New Roman"/>
+                <w:b w:val="0"/>
+                <w:sz w:val="26"/>
+                <w:rtl w:val="0"/>
+              </w:rPr>
+            </w:r>
+          </w:p>
+        </w:tc>
+        <w:tc>
+          <w:tcPr>
+            <w:tcMar>
+              <w:top w:w="60.0" w:type="dxa"/>
+              <w:left w:w="100.0" w:type="dxa"/>
+              <w:bottom w:w="60.0" w:type="dxa"/>
+              <w:right w:w="100.0" w:type="dxa"/>
+            </w:tcMar>
+          </w:tcPr>
+          <w:p>
+            <w:r>
+              <w:rPr>
+                <w:rFonts w:ascii="Times New Roman" w:hAnsi="Times New Roman" w:cs="Times New Roman"/>
+                <w:b w:val="0"/>
+                <w:sz w:val="26"/>
+              </w:rPr>
               <w:t>$790 / tháng</w:t>
             </w:r>
           </w:p>
@@ -1618,12 +1766,12 @@
             </w:pPr>
             <w:r>
               <w:rPr>
-                <w:rFonts w:ascii="Arial" w:cs="Arial" w:eastAsia="Arial" w:hAnsi="Arial"/>
+                <w:rFonts w:ascii="Times New Roman" w:cs="Times New Roman" w:eastAsia="Arial" w:hAnsi="Times New Roman"/>
                 <w:b w:val="0"/>
                 <w:bCs w:val="0"/>
                 <w:i w:val="0"/>
                 <w:iCs w:val="0"/>
-                <w:sz w:val="16"/>
+                <w:sz w:val="26"/>
                 <w:szCs w:val="16"/>
                 <w:rtl w:val="0"/>
               </w:rPr>
@@ -1631,6 +1779,9 @@
             </w:r>
             <w:r>
               <w:rPr>
+                <w:rFonts w:ascii="Times New Roman" w:hAnsi="Times New Roman" w:cs="Times New Roman"/>
+                <w:b w:val="0"/>
+                <w:sz w:val="26"/>
                 <w:rtl w:val="0"/>
               </w:rPr>
             </w:r>
@@ -1658,12 +1809,12 @@
             </w:pPr>
             <w:r>
               <w:rPr>
-                <w:rFonts w:ascii="Arial" w:cs="Arial" w:eastAsia="Arial" w:hAnsi="Arial"/>
+                <w:rFonts w:ascii="Times New Roman" w:cs="Times New Roman" w:eastAsia="Arial" w:hAnsi="Times New Roman"/>
                 <w:b w:val="0"/>
                 <w:bCs w:val="0"/>
                 <w:i w:val="0"/>
                 <w:iCs w:val="0"/>
-                <w:sz w:val="18"/>
+                <w:sz w:val="26"/>
                 <w:szCs w:val="18"/>
                 <w:rtl w:val="0"/>
               </w:rPr>
@@ -1671,22 +1822,30 @@
             </w:r>
             <w:r>
               <w:rPr>
-                <w:rtl w:val="0"/>
-              </w:rPr>
-            </w:r>
-          </w:p>
-        </w:tc>
-        <w:tc>
-          <w:tcPr>
-            <w:tcMar>
-              <w:top w:w="60.0" w:type="dxa"/>
-              <w:left w:w="100.0" w:type="dxa"/>
-              <w:bottom w:w="60.0" w:type="dxa"/>
-              <w:right w:w="100.0" w:type="dxa"/>
-            </w:tcMar>
-          </w:tcPr>
-          <w:p>
-            <w:r>
+                <w:rFonts w:ascii="Times New Roman" w:hAnsi="Times New Roman" w:cs="Times New Roman"/>
+                <w:b w:val="0"/>
+                <w:sz w:val="26"/>
+                <w:rtl w:val="0"/>
+              </w:rPr>
+            </w:r>
+          </w:p>
+        </w:tc>
+        <w:tc>
+          <w:tcPr>
+            <w:tcMar>
+              <w:top w:w="60.0" w:type="dxa"/>
+              <w:left w:w="100.0" w:type="dxa"/>
+              <w:bottom w:w="60.0" w:type="dxa"/>
+              <w:right w:w="100.0" w:type="dxa"/>
+            </w:tcMar>
+          </w:tcPr>
+          <w:p>
+            <w:r>
+              <w:rPr>
+                <w:rFonts w:ascii="Times New Roman" w:hAnsi="Times New Roman" w:cs="Times New Roman"/>
+                <w:b w:val="0"/>
+                <w:sz w:val="26"/>
+              </w:rPr>
               <w:t>$10.132 / khách</w:t>
             </w:r>
           </w:p>
@@ -1707,12 +1866,12 @@
             </w:pPr>
             <w:r>
               <w:rPr>
-                <w:rFonts w:ascii="Arial" w:cs="Arial" w:eastAsia="Arial" w:hAnsi="Arial"/>
+                <w:rFonts w:ascii="Times New Roman" w:cs="Times New Roman" w:eastAsia="Arial" w:hAnsi="Times New Roman"/>
                 <w:b w:val="0"/>
                 <w:bCs w:val="0"/>
                 <w:i w:val="0"/>
                 <w:iCs w:val="0"/>
-                <w:sz w:val="16"/>
+                <w:sz w:val="26"/>
                 <w:szCs w:val="16"/>
                 <w:rtl w:val="0"/>
               </w:rPr>
@@ -1720,6 +1879,9 @@
             </w:r>
             <w:r>
               <w:rPr>
+                <w:rFonts w:ascii="Times New Roman" w:hAnsi="Times New Roman" w:cs="Times New Roman"/>
+                <w:b w:val="0"/>
+                <w:sz w:val="26"/>
                 <w:rtl w:val="0"/>
               </w:rPr>
             </w:r>
@@ -1747,12 +1909,12 @@
             </w:pPr>
             <w:r>
               <w:rPr>
-                <w:rFonts w:ascii="Arial" w:cs="Arial" w:eastAsia="Arial" w:hAnsi="Arial"/>
+                <w:rFonts w:ascii="Times New Roman" w:cs="Times New Roman" w:eastAsia="Arial" w:hAnsi="Times New Roman"/>
                 <w:b w:val="0"/>
                 <w:bCs w:val="0"/>
                 <w:i w:val="0"/>
                 <w:iCs w:val="0"/>
-                <w:sz w:val="18"/>
+                <w:sz w:val="26"/>
                 <w:szCs w:val="18"/>
                 <w:rtl w:val="0"/>
               </w:rPr>
@@ -1760,22 +1922,30 @@
             </w:r>
             <w:r>
               <w:rPr>
-                <w:rtl w:val="0"/>
-              </w:rPr>
-            </w:r>
-          </w:p>
-        </w:tc>
-        <w:tc>
-          <w:tcPr>
-            <w:tcMar>
-              <w:top w:w="60.0" w:type="dxa"/>
-              <w:left w:w="100.0" w:type="dxa"/>
-              <w:bottom w:w="60.0" w:type="dxa"/>
-              <w:right w:w="100.0" w:type="dxa"/>
-            </w:tcMar>
-          </w:tcPr>
-          <w:p>
-            <w:r>
+                <w:rFonts w:ascii="Times New Roman" w:hAnsi="Times New Roman" w:cs="Times New Roman"/>
+                <w:b w:val="0"/>
+                <w:sz w:val="26"/>
+                <w:rtl w:val="0"/>
+              </w:rPr>
+            </w:r>
+          </w:p>
+        </w:tc>
+        <w:tc>
+          <w:tcPr>
+            <w:tcMar>
+              <w:top w:w="60.0" w:type="dxa"/>
+              <w:left w:w="100.0" w:type="dxa"/>
+              <w:bottom w:w="60.0" w:type="dxa"/>
+              <w:right w:w="100.0" w:type="dxa"/>
+            </w:tcMar>
+          </w:tcPr>
+          <w:p>
+            <w:r>
+              <w:rPr>
+                <w:rFonts w:ascii="Times New Roman" w:hAnsi="Times New Roman" w:cs="Times New Roman"/>
+                <w:b w:val="0"/>
+                <w:sz w:val="26"/>
+              </w:rPr>
               <w:t>0,21 deal / ngày</w:t>
             </w:r>
           </w:p>
@@ -1796,12 +1966,12 @@
             </w:pPr>
             <w:r>
               <w:rPr>
-                <w:rFonts w:ascii="Arial" w:cs="Arial" w:eastAsia="Arial" w:hAnsi="Arial"/>
+                <w:rFonts w:ascii="Times New Roman" w:cs="Times New Roman" w:eastAsia="Arial" w:hAnsi="Times New Roman"/>
                 <w:b w:val="0"/>
                 <w:bCs w:val="0"/>
                 <w:i w:val="0"/>
                 <w:iCs w:val="0"/>
-                <w:sz w:val="16"/>
+                <w:sz w:val="26"/>
                 <w:szCs w:val="16"/>
                 <w:rtl w:val="0"/>
               </w:rPr>
@@ -1809,6 +1979,9 @@
             </w:r>
             <w:r>
               <w:rPr>
+                <w:rFonts w:ascii="Times New Roman" w:hAnsi="Times New Roman" w:cs="Times New Roman"/>
+                <w:b w:val="0"/>
+                <w:sz w:val="26"/>
                 <w:rtl w:val="0"/>
               </w:rPr>
             </w:r>
@@ -1836,12 +2009,12 @@
             </w:pPr>
             <w:r>
               <w:rPr>
-                <w:rFonts w:ascii="Arial" w:cs="Arial" w:eastAsia="Arial" w:hAnsi="Arial"/>
+                <w:rFonts w:ascii="Times New Roman" w:cs="Times New Roman" w:eastAsia="Arial" w:hAnsi="Times New Roman"/>
                 <w:b w:val="0"/>
                 <w:bCs w:val="0"/>
                 <w:i w:val="0"/>
                 <w:iCs w:val="0"/>
-                <w:sz w:val="18"/>
+                <w:sz w:val="26"/>
                 <w:szCs w:val="18"/>
                 <w:rtl w:val="0"/>
               </w:rPr>
@@ -1849,22 +2022,30 @@
             </w:r>
             <w:r>
               <w:rPr>
-                <w:rtl w:val="0"/>
-              </w:rPr>
-            </w:r>
-          </w:p>
-        </w:tc>
-        <w:tc>
-          <w:tcPr>
-            <w:tcMar>
-              <w:top w:w="60.0" w:type="dxa"/>
-              <w:left w:w="100.0" w:type="dxa"/>
-              <w:bottom w:w="60.0" w:type="dxa"/>
-              <w:right w:w="100.0" w:type="dxa"/>
-            </w:tcMar>
-          </w:tcPr>
-          <w:p>
-            <w:r>
+                <w:rFonts w:ascii="Times New Roman" w:hAnsi="Times New Roman" w:cs="Times New Roman"/>
+                <w:b w:val="0"/>
+                <w:sz w:val="26"/>
+                <w:rtl w:val="0"/>
+              </w:rPr>
+            </w:r>
+          </w:p>
+        </w:tc>
+        <w:tc>
+          <w:tcPr>
+            <w:tcMar>
+              <w:top w:w="60.0" w:type="dxa"/>
+              <w:left w:w="100.0" w:type="dxa"/>
+              <w:bottom w:w="60.0" w:type="dxa"/>
+              <w:right w:w="100.0" w:type="dxa"/>
+            </w:tcMar>
+          </w:tcPr>
+          <w:p>
+            <w:r>
+              <w:rPr>
+                <w:rFonts w:ascii="Times New Roman" w:hAnsi="Times New Roman" w:cs="Times New Roman"/>
+                <w:b w:val="0"/>
+                <w:sz w:val="26"/>
+              </w:rPr>
               <w:t>$32.000 / khách</w:t>
             </w:r>
           </w:p>
@@ -1885,12 +2066,12 @@
             </w:pPr>
             <w:r>
               <w:rPr>
-                <w:rFonts w:ascii="Arial" w:cs="Arial" w:eastAsia="Arial" w:hAnsi="Arial"/>
+                <w:rFonts w:ascii="Times New Roman" w:cs="Times New Roman" w:eastAsia="Arial" w:hAnsi="Times New Roman"/>
                 <w:b w:val="0"/>
                 <w:bCs w:val="0"/>
                 <w:i w:val="0"/>
                 <w:iCs w:val="0"/>
-                <w:sz w:val="16"/>
+                <w:sz w:val="26"/>
                 <w:szCs w:val="16"/>
                 <w:rtl w:val="0"/>
               </w:rPr>
@@ -1898,6 +2079,9 @@
             </w:r>
             <w:r>
               <w:rPr>
+                <w:rFonts w:ascii="Times New Roman" w:hAnsi="Times New Roman" w:cs="Times New Roman"/>
+                <w:b w:val="0"/>
+                <w:sz w:val="26"/>
                 <w:rtl w:val="0"/>
               </w:rPr>
             </w:r>
@@ -1925,12 +2109,12 @@
             </w:pPr>
             <w:r>
               <w:rPr>
-                <w:rFonts w:ascii="Arial" w:cs="Arial" w:eastAsia="Arial" w:hAnsi="Arial"/>
+                <w:rFonts w:ascii="Times New Roman" w:cs="Times New Roman" w:eastAsia="Arial" w:hAnsi="Times New Roman"/>
                 <w:b w:val="0"/>
                 <w:bCs w:val="0"/>
                 <w:i w:val="0"/>
                 <w:iCs w:val="0"/>
-                <w:sz w:val="18"/>
+                <w:sz w:val="26"/>
                 <w:szCs w:val="18"/>
                 <w:rtl w:val="0"/>
               </w:rPr>
@@ -1938,22 +2122,30 @@
             </w:r>
             <w:r>
               <w:rPr>
-                <w:rtl w:val="0"/>
-              </w:rPr>
-            </w:r>
-          </w:p>
-        </w:tc>
-        <w:tc>
-          <w:tcPr>
-            <w:tcMar>
-              <w:top w:w="60.0" w:type="dxa"/>
-              <w:left w:w="100.0" w:type="dxa"/>
-              <w:bottom w:w="60.0" w:type="dxa"/>
-              <w:right w:w="100.0" w:type="dxa"/>
-            </w:tcMar>
-          </w:tcPr>
-          <w:p>
-            <w:r>
+                <w:rFonts w:ascii="Times New Roman" w:hAnsi="Times New Roman" w:cs="Times New Roman"/>
+                <w:b w:val="0"/>
+                <w:sz w:val="26"/>
+                <w:rtl w:val="0"/>
+              </w:rPr>
+            </w:r>
+          </w:p>
+        </w:tc>
+        <w:tc>
+          <w:tcPr>
+            <w:tcMar>
+              <w:top w:w="60.0" w:type="dxa"/>
+              <w:left w:w="100.0" w:type="dxa"/>
+              <w:bottom w:w="60.0" w:type="dxa"/>
+              <w:right w:w="100.0" w:type="dxa"/>
+            </w:tcMar>
+          </w:tcPr>
+          <w:p>
+            <w:r>
+              <w:rPr>
+                <w:rFonts w:ascii="Times New Roman" w:hAnsi="Times New Roman" w:cs="Times New Roman"/>
+                <w:b w:val="0"/>
+                <w:sz w:val="26"/>
+              </w:rPr>
               <w:t>3,16 lần (Bất khả thi Sales-Led)</w:t>
             </w:r>
           </w:p>
@@ -1974,12 +2166,12 @@
             </w:pPr>
             <w:r>
               <w:rPr>
-                <w:rFonts w:ascii="Arial" w:cs="Arial" w:eastAsia="Arial" w:hAnsi="Arial"/>
+                <w:rFonts w:ascii="Times New Roman" w:cs="Times New Roman" w:eastAsia="Arial" w:hAnsi="Times New Roman"/>
                 <w:b w:val="0"/>
                 <w:bCs w:val="0"/>
                 <w:i w:val="0"/>
                 <w:iCs w:val="0"/>
-                <w:sz w:val="16"/>
+                <w:sz w:val="26"/>
                 <w:szCs w:val="16"/>
                 <w:rtl w:val="0"/>
               </w:rPr>
@@ -1987,6 +2179,9 @@
             </w:r>
             <w:r>
               <w:rPr>
+                <w:rFonts w:ascii="Times New Roman" w:hAnsi="Times New Roman" w:cs="Times New Roman"/>
+                <w:b w:val="0"/>
+                <w:sz w:val="26"/>
                 <w:rtl w:val="0"/>
               </w:rPr>
             </w:r>
@@ -2001,6 +2196,8 @@
       </w:pPr>
       <w:r>
         <w:rPr>
+          <w:rFonts w:ascii="Times New Roman" w:hAnsi="Times New Roman" w:cs="Times New Roman"/>
+          <w:sz w:val="26"/>
           <w:rtl w:val="0"/>
         </w:rPr>
       </w:r>
@@ -2012,11 +2209,11 @@
       </w:pPr>
       <w:r>
         <w:rPr>
-          <w:rFonts w:ascii="Arial" w:cs="Arial" w:eastAsia="Arial" w:hAnsi="Arial"/>
+          <w:rFonts w:ascii="Times New Roman" w:cs="Times New Roman" w:eastAsia="Arial" w:hAnsi="Times New Roman"/>
           <w:b w:val="1"/>
           <w:bCs w:val="1"/>
           <w:color w:val="4f46e5"/>
-          <w:sz w:val="16"/>
+          <w:sz w:val="26"/>
           <w:szCs w:val="16"/>
           <w:rtl w:val="0"/>
         </w:rPr>
@@ -2024,6 +2221,8 @@
       </w:r>
       <w:r>
         <w:rPr>
+          <w:rFonts w:ascii="Times New Roman" w:hAnsi="Times New Roman" w:cs="Times New Roman"/>
+          <w:sz w:val="26"/>
           <w:rtl w:val="0"/>
         </w:rPr>
       </w:r>
@@ -2034,9 +2233,13 @@
         <w:rPr/>
       </w:pPr>
       <w:r>
+        <w:rPr>
+          <w:rFonts w:ascii="Times New Roman" w:hAnsi="Times New Roman" w:cs="Times New Roman"/>
+          <w:sz w:val="26"/>
+        </w:rPr>
         <w:t>MẤY GIỜ + KHÁCH ĐANG LÀM GÌ + DÙNG APP/KÊNH NÀO. 'Khi khách cần hỗ trợ' không được tính.</w:t>
         <w:br/>
-        <w:t>→ 21:30 – 23:30 đêm (MẤY GIỜ) + Bệnh nhân hoặc người nhà lo lắng vì triệu chứng bất thường xuất hiện trong đêm (sốt cao co giật ở trẻ, tức ngực, đau bụng dữ dội), băn khoăn hoảng loạn không biết có cần vào viện cấp cứu ngay trong đêm hay đợi sáng mai (ĐANG LÀM GÌ) + Đang cầm điện thoại tìm kiếm Zalo OA Vinmec hoặc mở ứng dụng MyVinmec để tìm cách liên hệ khẩn cấp (DÙNG APP NÀO).</w:t>
+        <w:t>Trả lời: 21:30 – 23:30 (MẤY GIỜ) + Người bệnh hoặc người nhà lo lắng vì triệu chứng bất thường ban đêm, cần biết mức độ khẩn cấp để quyết định đi cấp cứu hay chờ sáng mai khám (ĐANG LÀM GÌ) + Mở Zalo tìm Zalo OA Vinmec hoặc mở ứng dụng MyVinmec để liên hệ (DÙNG APP NÀO).</w:t>
       </w:r>
     </w:p>
     <w:p>
@@ -2049,8 +2252,8 @@
       </w:pPr>
       <w:r>
         <w:rPr>
-          <w:rFonts w:ascii="Arial" w:cs="Arial" w:eastAsia="Arial" w:hAnsi="Arial"/>
-          <w:sz w:val="20"/>
+          <w:rFonts w:ascii="Times New Roman" w:cs="Times New Roman" w:eastAsia="Arial" w:hAnsi="Times New Roman"/>
+          <w:sz w:val="26"/>
           <w:szCs w:val="20"/>
           <w:rtl w:val="0"/>
         </w:rPr>
@@ -2058,6 +2261,8 @@
       </w:r>
       <w:r>
         <w:rPr>
+          <w:rFonts w:ascii="Times New Roman" w:hAnsi="Times New Roman" w:cs="Times New Roman"/>
+          <w:sz w:val="26"/>
           <w:rtl w:val="0"/>
         </w:rPr>
       </w:r>
@@ -2072,8 +2277,8 @@
       </w:pPr>
       <w:r>
         <w:rPr>
-          <w:rFonts w:ascii="Arial" w:cs="Arial" w:eastAsia="Arial" w:hAnsi="Arial"/>
-          <w:sz w:val="20"/>
+          <w:rFonts w:ascii="Times New Roman" w:cs="Times New Roman" w:eastAsia="Arial" w:hAnsi="Times New Roman"/>
+          <w:sz w:val="26"/>
           <w:szCs w:val="20"/>
           <w:rtl w:val="0"/>
         </w:rPr>
@@ -2081,6 +2286,8 @@
       </w:r>
       <w:r>
         <w:rPr>
+          <w:rFonts w:ascii="Times New Roman" w:hAnsi="Times New Roman" w:cs="Times New Roman"/>
+          <w:sz w:val="26"/>
           <w:rtl w:val="0"/>
         </w:rPr>
       </w:r>
@@ -2092,11 +2299,11 @@
       </w:pPr>
       <w:r>
         <w:rPr>
-          <w:rFonts w:ascii="Arial" w:cs="Arial" w:eastAsia="Arial" w:hAnsi="Arial"/>
+          <w:rFonts w:ascii="Times New Roman" w:cs="Times New Roman" w:eastAsia="Arial" w:hAnsi="Times New Roman"/>
           <w:b w:val="1"/>
           <w:bCs w:val="1"/>
           <w:color w:val="4f46e5"/>
-          <w:sz w:val="16"/>
+          <w:sz w:val="26"/>
           <w:szCs w:val="16"/>
           <w:rtl w:val="0"/>
         </w:rPr>
@@ -2104,6 +2311,8 @@
       </w:r>
       <w:r>
         <w:rPr>
+          <w:rFonts w:ascii="Times New Roman" w:hAnsi="Times New Roman" w:cs="Times New Roman"/>
+          <w:sz w:val="26"/>
           <w:rtl w:val="0"/>
         </w:rPr>
       </w:r>
@@ -2114,9 +2323,13 @@
         <w:rPr/>
       </w:pPr>
       <w:r>
+        <w:rPr>
+          <w:rFonts w:ascii="Times New Roman" w:hAnsi="Times New Roman" w:cs="Times New Roman"/>
+          <w:sz w:val="26"/>
+        </w:rPr>
         <w:t>Sản phẩm của bạn nằm ở đâu để có mặt đúng lúc đó? Một bề mặt tích hợp có tên — không phải 'website của chúng tôi'.</w:t>
         <w:br/>
-        <w:t>→ Zero-friction surface: Widget/Mini-app 'Sơ loại triệu chứng 24/7' nhúng trực tiếp trong menu Zalo OA Vinmec và mục Tiếp nhận khám bệnh trên ứng dụng MyVinmec. Không bắt người bệnh tải ứng dụng mới, không mở web ngoài, phản hồi lập tức trong 3 giây.</w:t>
+        <w:t>Trả lời: Tính năng 'Sơ loại triệu chứng 24/7' tích hợp trực tiếp trong menu Zalo OA Vinmec và mục Tiếp nhận khám trên ứng dụng MyVinmec (không yêu cầu cài đặt ứng dụng mới hay mở trình duyệt ngoài).</w:t>
       </w:r>
     </w:p>
     <w:p>
@@ -2129,8 +2342,8 @@
       </w:pPr>
       <w:r>
         <w:rPr>
-          <w:rFonts w:ascii="Arial" w:cs="Arial" w:eastAsia="Arial" w:hAnsi="Arial"/>
-          <w:sz w:val="20"/>
+          <w:rFonts w:ascii="Times New Roman" w:cs="Times New Roman" w:eastAsia="Arial" w:hAnsi="Times New Roman"/>
+          <w:sz w:val="26"/>
           <w:szCs w:val="20"/>
           <w:rtl w:val="0"/>
         </w:rPr>
@@ -2138,6 +2351,8 @@
       </w:r>
       <w:r>
         <w:rPr>
+          <w:rFonts w:ascii="Times New Roman" w:hAnsi="Times New Roman" w:cs="Times New Roman"/>
+          <w:sz w:val="26"/>
           <w:rtl w:val="0"/>
         </w:rPr>
       </w:r>
@@ -2149,11 +2364,11 @@
       </w:pPr>
       <w:r>
         <w:rPr>
-          <w:rFonts w:ascii="Arial" w:cs="Arial" w:eastAsia="Arial" w:hAnsi="Arial"/>
+          <w:rFonts w:ascii="Times New Roman" w:cs="Times New Roman" w:eastAsia="Arial" w:hAnsi="Times New Roman"/>
           <w:b w:val="1"/>
           <w:bCs w:val="1"/>
           <w:color w:val="4f46e5"/>
-          <w:sz w:val="16"/>
+          <w:sz w:val="26"/>
           <w:szCs w:val="16"/>
           <w:rtl w:val="0"/>
         </w:rPr>
@@ -2161,6 +2376,8 @@
       </w:r>
       <w:r>
         <w:rPr>
+          <w:rFonts w:ascii="Times New Roman" w:hAnsi="Times New Roman" w:cs="Times New Roman"/>
+          <w:sz w:val="26"/>
           <w:rtl w:val="0"/>
         </w:rPr>
       </w:r>
@@ -2217,6 +2434,9 @@
             </w:pPr>
             <w:r>
               <w:rPr>
+                <w:rFonts w:ascii="Times New Roman" w:hAnsi="Times New Roman" w:cs="Times New Roman"/>
+                <w:b/>
+                <w:sz w:val="26"/>
                 <w:rtl w:val="0"/>
               </w:rPr>
             </w:r>
@@ -2239,12 +2459,12 @@
             </w:pPr>
             <w:r>
               <w:rPr>
-                <w:rFonts w:ascii="Arial" w:cs="Arial" w:eastAsia="Arial" w:hAnsi="Arial"/>
-                <w:b w:val="1"/>
+                <w:rFonts w:ascii="Times New Roman" w:cs="Times New Roman" w:eastAsia="Arial" w:hAnsi="Times New Roman"/>
+                <w:b/>
                 <w:bCs w:val="1"/>
                 <w:i w:val="0"/>
                 <w:iCs w:val="0"/>
-                <w:sz w:val="18"/>
+                <w:sz w:val="26"/>
                 <w:szCs w:val="18"/>
                 <w:rtl w:val="0"/>
               </w:rPr>
@@ -2252,6 +2472,9 @@
             </w:r>
             <w:r>
               <w:rPr>
+                <w:rFonts w:ascii="Times New Roman" w:hAnsi="Times New Roman" w:cs="Times New Roman"/>
+                <w:b/>
+                <w:sz w:val="26"/>
                 <w:rtl w:val="0"/>
               </w:rPr>
             </w:r>
@@ -2274,12 +2497,12 @@
             </w:pPr>
             <w:r>
               <w:rPr>
-                <w:rFonts w:ascii="Arial" w:cs="Arial" w:eastAsia="Arial" w:hAnsi="Arial"/>
-                <w:b w:val="1"/>
+                <w:rFonts w:ascii="Times New Roman" w:cs="Times New Roman" w:eastAsia="Arial" w:hAnsi="Times New Roman"/>
+                <w:b/>
                 <w:bCs w:val="1"/>
                 <w:i w:val="0"/>
                 <w:iCs w:val="0"/>
-                <w:sz w:val="18"/>
+                <w:sz w:val="26"/>
                 <w:szCs w:val="18"/>
                 <w:rtl w:val="0"/>
               </w:rPr>
@@ -2287,6 +2510,9 @@
             </w:r>
             <w:r>
               <w:rPr>
+                <w:rFonts w:ascii="Times New Roman" w:hAnsi="Times New Roman" w:cs="Times New Roman"/>
+                <w:b/>
+                <w:sz w:val="26"/>
                 <w:rtl w:val="0"/>
               </w:rPr>
             </w:r>
@@ -2309,12 +2535,12 @@
             </w:pPr>
             <w:r>
               <w:rPr>
-                <w:rFonts w:ascii="Arial" w:cs="Arial" w:eastAsia="Arial" w:hAnsi="Arial"/>
-                <w:b w:val="1"/>
+                <w:rFonts w:ascii="Times New Roman" w:cs="Times New Roman" w:eastAsia="Arial" w:hAnsi="Times New Roman"/>
+                <w:b/>
                 <w:bCs w:val="1"/>
                 <w:i w:val="0"/>
                 <w:iCs w:val="0"/>
-                <w:sz w:val="18"/>
+                <w:sz w:val="26"/>
                 <w:szCs w:val="18"/>
                 <w:rtl w:val="0"/>
               </w:rPr>
@@ -2322,6 +2548,9 @@
             </w:r>
             <w:r>
               <w:rPr>
+                <w:rFonts w:ascii="Times New Roman" w:hAnsi="Times New Roman" w:cs="Times New Roman"/>
+                <w:b/>
+                <w:sz w:val="26"/>
                 <w:rtl w:val="0"/>
               </w:rPr>
             </w:r>
@@ -2349,12 +2578,12 @@
             </w:pPr>
             <w:r>
               <w:rPr>
-                <w:rFonts w:ascii="Arial" w:cs="Arial" w:eastAsia="Arial" w:hAnsi="Arial"/>
-                <w:b w:val="1"/>
+                <w:rFonts w:ascii="Times New Roman" w:cs="Times New Roman" w:eastAsia="Arial" w:hAnsi="Times New Roman"/>
+                <w:b w:val="0"/>
                 <w:bCs w:val="1"/>
                 <w:i w:val="0"/>
                 <w:iCs w:val="0"/>
-                <w:sz w:val="16"/>
+                <w:sz w:val="26"/>
                 <w:szCs w:val="16"/>
                 <w:rtl w:val="0"/>
               </w:rPr>
@@ -2362,53 +2591,71 @@
             </w:r>
             <w:r>
               <w:rPr>
-                <w:rtl w:val="0"/>
-              </w:rPr>
-            </w:r>
-          </w:p>
-        </w:tc>
-        <w:tc>
-          <w:tcPr>
-            <w:tcMar>
-              <w:top w:w="60.0" w:type="dxa"/>
-              <w:left w:w="100.0" w:type="dxa"/>
-              <w:bottom w:w="60.0" w:type="dxa"/>
-              <w:right w:w="100.0" w:type="dxa"/>
-            </w:tcMar>
-          </w:tcPr>
-          <w:p>
-            <w:r>
-              <w:t>Partner-Led (Pilot nội bộ tại BVĐKQT Vinmec Times City)</w:t>
-            </w:r>
-          </w:p>
-        </w:tc>
-        <w:tc>
-          <w:tcPr>
-            <w:tcMar>
-              <w:top w:w="60.0" w:type="dxa"/>
-              <w:left w:w="100.0" w:type="dxa"/>
-              <w:bottom w:w="60.0" w:type="dxa"/>
-              <w:right w:w="100.0" w:type="dxa"/>
-            </w:tcMar>
-          </w:tcPr>
-          <w:p>
-            <w:r>
-              <w:t>Partner-Led (Mở rộng toàn bộ 7 bệnh viện Vinmec trên toàn quốc)</w:t>
-            </w:r>
-          </w:p>
-        </w:tc>
-        <w:tc>
-          <w:tcPr>
-            <w:tcMar>
-              <w:top w:w="60.0" w:type="dxa"/>
-              <w:left w:w="100.0" w:type="dxa"/>
-              <w:bottom w:w="60.0" w:type="dxa"/>
-              <w:right w:w="100.0" w:type="dxa"/>
-            </w:tcMar>
-          </w:tcPr>
-          <w:p>
-            <w:r>
-              <w:t>Partner-Led &amp; Mid-market Inbound (Mở rộng sang các hệ thống y tế tư nhân khác)</w:t>
+                <w:rFonts w:ascii="Times New Roman" w:hAnsi="Times New Roman" w:cs="Times New Roman"/>
+                <w:b w:val="0"/>
+                <w:sz w:val="26"/>
+                <w:rtl w:val="0"/>
+              </w:rPr>
+            </w:r>
+          </w:p>
+        </w:tc>
+        <w:tc>
+          <w:tcPr>
+            <w:tcMar>
+              <w:top w:w="60.0" w:type="dxa"/>
+              <w:left w:w="100.0" w:type="dxa"/>
+              <w:bottom w:w="60.0" w:type="dxa"/>
+              <w:right w:w="100.0" w:type="dxa"/>
+            </w:tcMar>
+          </w:tcPr>
+          <w:p>
+            <w:r>
+              <w:rPr>
+                <w:rFonts w:ascii="Times New Roman" w:hAnsi="Times New Roman" w:cs="Times New Roman"/>
+                <w:b w:val="0"/>
+                <w:sz w:val="26"/>
+              </w:rPr>
+              <w:t>Partner-Led (Pilot BV Vinmec Times City)</w:t>
+            </w:r>
+          </w:p>
+        </w:tc>
+        <w:tc>
+          <w:tcPr>
+            <w:tcMar>
+              <w:top w:w="60.0" w:type="dxa"/>
+              <w:left w:w="100.0" w:type="dxa"/>
+              <w:bottom w:w="60.0" w:type="dxa"/>
+              <w:right w:w="100.0" w:type="dxa"/>
+            </w:tcMar>
+          </w:tcPr>
+          <w:p>
+            <w:r>
+              <w:rPr>
+                <w:rFonts w:ascii="Times New Roman" w:hAnsi="Times New Roman" w:cs="Times New Roman"/>
+                <w:b w:val="0"/>
+                <w:sz w:val="26"/>
+              </w:rPr>
+              <w:t>Partner-Led (Mở rộng 7 BV và 3 PK Vinmec)</w:t>
+            </w:r>
+          </w:p>
+        </w:tc>
+        <w:tc>
+          <w:tcPr>
+            <w:tcMar>
+              <w:top w:w="60.0" w:type="dxa"/>
+              <w:left w:w="100.0" w:type="dxa"/>
+              <w:bottom w:w="60.0" w:type="dxa"/>
+              <w:right w:w="100.0" w:type="dxa"/>
+            </w:tcMar>
+          </w:tcPr>
+          <w:p>
+            <w:r>
+              <w:rPr>
+                <w:rFonts w:ascii="Times New Roman" w:hAnsi="Times New Roman" w:cs="Times New Roman"/>
+                <w:b w:val="0"/>
+                <w:sz w:val="26"/>
+              </w:rPr>
+              <w:t>Partner-Led và Inbound (Chuỗi y tế tư nhân khác)</w:t>
             </w:r>
           </w:p>
         </w:tc>
@@ -2434,12 +2681,12 @@
             </w:pPr>
             <w:r>
               <w:rPr>
-                <w:rFonts w:ascii="Arial" w:cs="Arial" w:eastAsia="Arial" w:hAnsi="Arial"/>
-                <w:b w:val="1"/>
+                <w:rFonts w:ascii="Times New Roman" w:cs="Times New Roman" w:eastAsia="Arial" w:hAnsi="Times New Roman"/>
+                <w:b w:val="0"/>
                 <w:bCs w:val="1"/>
                 <w:i w:val="0"/>
                 <w:iCs w:val="0"/>
-                <w:sz w:val="16"/>
+                <w:sz w:val="26"/>
                 <w:szCs w:val="16"/>
                 <w:rtl w:val="0"/>
               </w:rPr>
@@ -2447,53 +2694,71 @@
             </w:r>
             <w:r>
               <w:rPr>
-                <w:rtl w:val="0"/>
-              </w:rPr>
-            </w:r>
-          </w:p>
-        </w:tc>
-        <w:tc>
-          <w:tcPr>
-            <w:tcMar>
-              <w:top w:w="60.0" w:type="dxa"/>
-              <w:left w:w="100.0" w:type="dxa"/>
-              <w:bottom w:w="60.0" w:type="dxa"/>
-              <w:right w:w="100.0" w:type="dxa"/>
-            </w:tcMar>
-          </w:tcPr>
-          <w:p>
-            <w:r>
-              <w:t>1 cơ sở pilot (1.500 ca intake/tháng)</w:t>
-            </w:r>
-          </w:p>
-        </w:tc>
-        <w:tc>
-          <w:tcPr>
-            <w:tcMar>
-              <w:top w:w="60.0" w:type="dxa"/>
-              <w:left w:w="100.0" w:type="dxa"/>
-              <w:bottom w:w="60.0" w:type="dxa"/>
-              <w:right w:w="100.0" w:type="dxa"/>
-            </w:tcMar>
-          </w:tcPr>
-          <w:p>
-            <w:r>
-              <w:t>7 bệnh viện + 3 phòng khám Vinmec (12.000 ca/tháng)</w:t>
-            </w:r>
-          </w:p>
-        </w:tc>
-        <w:tc>
-          <w:tcPr>
-            <w:tcMar>
-              <w:top w:w="60.0" w:type="dxa"/>
-              <w:left w:w="100.0" w:type="dxa"/>
-              <w:bottom w:w="60.0" w:type="dxa"/>
-              <w:right w:w="100.0" w:type="dxa"/>
-            </w:tcMar>
-          </w:tcPr>
-          <w:p>
-            <w:r>
-              <w:t>3 hệ thống y tế mới (40.000 ca/tháng)</w:t>
+                <w:rFonts w:ascii="Times New Roman" w:hAnsi="Times New Roman" w:cs="Times New Roman"/>
+                <w:b w:val="0"/>
+                <w:sz w:val="26"/>
+                <w:rtl w:val="0"/>
+              </w:rPr>
+            </w:r>
+          </w:p>
+        </w:tc>
+        <w:tc>
+          <w:tcPr>
+            <w:tcMar>
+              <w:top w:w="60.0" w:type="dxa"/>
+              <w:left w:w="100.0" w:type="dxa"/>
+              <w:bottom w:w="60.0" w:type="dxa"/>
+              <w:right w:w="100.0" w:type="dxa"/>
+            </w:tcMar>
+          </w:tcPr>
+          <w:p>
+            <w:r>
+              <w:rPr>
+                <w:rFonts w:ascii="Times New Roman" w:hAnsi="Times New Roman" w:cs="Times New Roman"/>
+                <w:b w:val="0"/>
+                <w:sz w:val="26"/>
+              </w:rPr>
+              <w:t>1 cơ sở (1.500 ca/tháng)</w:t>
+            </w:r>
+          </w:p>
+        </w:tc>
+        <w:tc>
+          <w:tcPr>
+            <w:tcMar>
+              <w:top w:w="60.0" w:type="dxa"/>
+              <w:left w:w="100.0" w:type="dxa"/>
+              <w:bottom w:w="60.0" w:type="dxa"/>
+              <w:right w:w="100.0" w:type="dxa"/>
+            </w:tcMar>
+          </w:tcPr>
+          <w:p>
+            <w:r>
+              <w:rPr>
+                <w:rFonts w:ascii="Times New Roman" w:hAnsi="Times New Roman" w:cs="Times New Roman"/>
+                <w:b w:val="0"/>
+                <w:sz w:val="26"/>
+              </w:rPr>
+              <w:t>10 cơ sở (12.000 ca/tháng)</w:t>
+            </w:r>
+          </w:p>
+        </w:tc>
+        <w:tc>
+          <w:tcPr>
+            <w:tcMar>
+              <w:top w:w="60.0" w:type="dxa"/>
+              <w:left w:w="100.0" w:type="dxa"/>
+              <w:bottom w:w="60.0" w:type="dxa"/>
+              <w:right w:w="100.0" w:type="dxa"/>
+            </w:tcMar>
+          </w:tcPr>
+          <w:p>
+            <w:r>
+              <w:rPr>
+                <w:rFonts w:ascii="Times New Roman" w:hAnsi="Times New Roman" w:cs="Times New Roman"/>
+                <w:b w:val="0"/>
+                <w:sz w:val="26"/>
+              </w:rPr>
+              <w:t>3 hệ thống mới (40.000 ca/tháng)</w:t>
             </w:r>
           </w:p>
         </w:tc>
@@ -2519,12 +2784,12 @@
             </w:pPr>
             <w:r>
               <w:rPr>
-                <w:rFonts w:ascii="Arial" w:cs="Arial" w:eastAsia="Arial" w:hAnsi="Arial"/>
-                <w:b w:val="1"/>
+                <w:rFonts w:ascii="Times New Roman" w:cs="Times New Roman" w:eastAsia="Arial" w:hAnsi="Times New Roman"/>
+                <w:b w:val="0"/>
                 <w:bCs w:val="1"/>
                 <w:i w:val="0"/>
                 <w:iCs w:val="0"/>
-                <w:sz w:val="16"/>
+                <w:sz w:val="26"/>
                 <w:szCs w:val="16"/>
                 <w:rtl w:val="0"/>
               </w:rPr>
@@ -2532,65 +2797,83 @@
             </w:r>
             <w:r>
               <w:rPr>
-                <w:rtl w:val="0"/>
-              </w:rPr>
-            </w:r>
-          </w:p>
-        </w:tc>
-        <w:tc>
-          <w:tcPr>
-            <w:tcMar>
-              <w:top w:w="60.0" w:type="dxa"/>
-              <w:left w:w="100.0" w:type="dxa"/>
-              <w:bottom w:w="60.0" w:type="dxa"/>
-              <w:right w:w="100.0" w:type="dxa"/>
-            </w:tcMar>
-          </w:tcPr>
-          <w:p>
-            <w:r>
-              <w:t>1. Tích hợp API sơ loại vào Zalo OA Vinmec Times City.</w:t>
+                <w:rFonts w:ascii="Times New Roman" w:hAnsi="Times New Roman" w:cs="Times New Roman"/>
+                <w:b w:val="0"/>
+                <w:sz w:val="26"/>
+                <w:rtl w:val="0"/>
+              </w:rPr>
+            </w:r>
+          </w:p>
+        </w:tc>
+        <w:tc>
+          <w:tcPr>
+            <w:tcMar>
+              <w:top w:w="60.0" w:type="dxa"/>
+              <w:left w:w="100.0" w:type="dxa"/>
+              <w:bottom w:w="60.0" w:type="dxa"/>
+              <w:right w:w="100.0" w:type="dxa"/>
+            </w:tcMar>
+          </w:tcPr>
+          <w:p>
+            <w:r>
+              <w:rPr>
+                <w:rFonts w:ascii="Times New Roman" w:hAnsi="Times New Roman" w:cs="Times New Roman"/>
+                <w:b w:val="0"/>
+                <w:sz w:val="26"/>
+              </w:rPr>
+              <w:t>1. Tích hợp API vào Zalo OA Vinmec Times City.</w:t>
               <w:br/>
-              <w:t>2. Phối hợp Hội đồng chuyên môn Vinmec chuẩn hóa 30 kịch bản Red Flags.</w:t>
+              <w:t>2. Chuẩn hóa 30 kịch bản Red Flags lâm sàng.</w:t>
               <w:br/>
-              <w:t>3. Thiết lập quy trình escalate tự động sang trực ban Cấp cứu (&lt;90s).</w:t>
-            </w:r>
-          </w:p>
-        </w:tc>
-        <w:tc>
-          <w:tcPr>
-            <w:tcMar>
-              <w:top w:w="60.0" w:type="dxa"/>
-              <w:left w:w="100.0" w:type="dxa"/>
-              <w:bottom w:w="60.0" w:type="dxa"/>
-              <w:right w:w="100.0" w:type="dxa"/>
-            </w:tcMar>
-          </w:tcPr>
-          <w:p>
-            <w:r>
-              <w:t>1. Tích hợp sâu hệ thống HIS/EHR Vinmec và phân bổ lịch khám.</w:t>
+              <w:t>3. Thiết lập chuyển tiếp tự động sang điều dưỡng (&lt;90s).</w:t>
+            </w:r>
+          </w:p>
+        </w:tc>
+        <w:tc>
+          <w:tcPr>
+            <w:tcMar>
+              <w:top w:w="60.0" w:type="dxa"/>
+              <w:left w:w="100.0" w:type="dxa"/>
+              <w:bottom w:w="60.0" w:type="dxa"/>
+              <w:right w:w="100.0" w:type="dxa"/>
+            </w:tcMar>
+          </w:tcPr>
+          <w:p>
+            <w:r>
+              <w:rPr>
+                <w:rFonts w:ascii="Times New Roman" w:hAnsi="Times New Roman" w:cs="Times New Roman"/>
+                <w:b w:val="0"/>
+                <w:sz w:val="26"/>
+              </w:rPr>
+              <w:t>1. Tích hợp sâu HIS/EHR và phân bổ lịch khám.</w:t>
               <w:br/>
-              <w:t>2. Tối ưu prompt caching, đẩy containment lên 78–80%.</w:t>
+              <w:t>2. Tối ưu prompt caching, nâng containment lên 78–80%.</w:t>
               <w:br/>
-              <w:t>3. Xây dựng Executive Dashboard đo Attribution &amp; GM cho BGD.</w:t>
-            </w:r>
-          </w:p>
-        </w:tc>
-        <w:tc>
-          <w:tcPr>
-            <w:tcMar>
-              <w:top w:w="60.0" w:type="dxa"/>
-              <w:left w:w="100.0" w:type="dxa"/>
-              <w:bottom w:w="60.0" w:type="dxa"/>
-              <w:right w:w="100.0" w:type="dxa"/>
-            </w:tcMar>
-          </w:tcPr>
-          <w:p>
-            <w:r>
-              <w:t>1. Đóng gói 'Clinical Triage Solution Pack' cho chuỗi bệnh viện tư.</w:t>
+              <w:t>3. Xây dựng dashboard Attribution và lợi nhuận.</w:t>
+            </w:r>
+          </w:p>
+        </w:tc>
+        <w:tc>
+          <w:tcPr>
+            <w:tcMar>
+              <w:top w:w="60.0" w:type="dxa"/>
+              <w:left w:w="100.0" w:type="dxa"/>
+              <w:bottom w:w="60.0" w:type="dxa"/>
+              <w:right w:w="100.0" w:type="dxa"/>
+            </w:tcMar>
+          </w:tcPr>
+          <w:p>
+            <w:r>
+              <w:rPr>
+                <w:rFonts w:ascii="Times New Roman" w:hAnsi="Times New Roman" w:cs="Times New Roman"/>
+                <w:b w:val="0"/>
+                <w:sz w:val="26"/>
+              </w:rPr>
+              <w:t>1. Đóng gói giải pháp cho chuỗi bệnh viện khác.</w:t>
               <w:br/>
-              <w:t>2. Mở rộng tính năng theo dõi triệu chứng sau khám (post-visit).</w:t>
+              <w:t>2. Bổ sung tính năng theo dõi sau khám.</w:t>
               <w:br/>
-              <w:t>3. Hoàn thiện chứng chỉ ISO 27001 và Nghị định 13/2023/NĐ-CP.</w:t>
+              <w:t>3. Hoàn thiện tuân thủ Nghị định 13 và ISO 27001.</w:t>
             </w:r>
           </w:p>
         </w:tc>
@@ -2616,12 +2899,12 @@
             </w:pPr>
             <w:r>
               <w:rPr>
-                <w:rFonts w:ascii="Arial" w:cs="Arial" w:eastAsia="Arial" w:hAnsi="Arial"/>
-                <w:b w:val="1"/>
+                <w:rFonts w:ascii="Times New Roman" w:cs="Times New Roman" w:eastAsia="Arial" w:hAnsi="Times New Roman"/>
+                <w:b w:val="0"/>
                 <w:bCs w:val="1"/>
                 <w:i w:val="0"/>
                 <w:iCs w:val="0"/>
-                <w:sz w:val="16"/>
+                <w:sz w:val="26"/>
                 <w:szCs w:val="16"/>
                 <w:rtl w:val="0"/>
               </w:rPr>
@@ -2629,53 +2912,71 @@
             </w:r>
             <w:r>
               <w:rPr>
-                <w:rtl w:val="0"/>
-              </w:rPr>
-            </w:r>
-          </w:p>
-        </w:tc>
-        <w:tc>
-          <w:tcPr>
-            <w:tcMar>
-              <w:top w:w="60.0" w:type="dxa"/>
-              <w:left w:w="100.0" w:type="dxa"/>
-              <w:bottom w:w="60.0" w:type="dxa"/>
-              <w:right w:w="100.0" w:type="dxa"/>
-            </w:tcMar>
-          </w:tcPr>
-          <w:p>
-            <w:r>
-              <w:t>Containment 75%, CSAT ≥ 4.5/5, 0 sự cố y khoa (zero missed red-flags).</w:t>
-            </w:r>
-          </w:p>
-        </w:tc>
-        <w:tc>
-          <w:tcPr>
-            <w:tcMar>
-              <w:top w:w="60.0" w:type="dxa"/>
-              <w:left w:w="100.0" w:type="dxa"/>
-              <w:bottom w:w="60.0" w:type="dxa"/>
-              <w:right w:w="100.0" w:type="dxa"/>
-            </w:tcMar>
-          </w:tcPr>
-          <w:p>
-            <w:r>
-              <w:t>Containment ≥ 78%, GM ≥ 71%, thời gian chờ tiếp nhận giảm 80%.</w:t>
-            </w:r>
-          </w:p>
-        </w:tc>
-        <w:tc>
-          <w:tcPr>
-            <w:tcMar>
-              <w:top w:w="60.0" w:type="dxa"/>
-              <w:left w:w="100.0" w:type="dxa"/>
-              <w:bottom w:w="60.0" w:type="dxa"/>
-              <w:right w:w="100.0" w:type="dxa"/>
-            </w:tcMar>
-          </w:tcPr>
-          <w:p>
-            <w:r>
-              <w:t>ARR đạt $380,000, CAC Payback &lt; 8 tháng, Net Retention Rate &gt; 120%.</w:t>
+                <w:rFonts w:ascii="Times New Roman" w:hAnsi="Times New Roman" w:cs="Times New Roman"/>
+                <w:b w:val="0"/>
+                <w:sz w:val="26"/>
+                <w:rtl w:val="0"/>
+              </w:rPr>
+            </w:r>
+          </w:p>
+        </w:tc>
+        <w:tc>
+          <w:tcPr>
+            <w:tcMar>
+              <w:top w:w="60.0" w:type="dxa"/>
+              <w:left w:w="100.0" w:type="dxa"/>
+              <w:bottom w:w="60.0" w:type="dxa"/>
+              <w:right w:w="100.0" w:type="dxa"/>
+            </w:tcMar>
+          </w:tcPr>
+          <w:p>
+            <w:r>
+              <w:rPr>
+                <w:rFonts w:ascii="Times New Roman" w:hAnsi="Times New Roman" w:cs="Times New Roman"/>
+                <w:b w:val="0"/>
+                <w:sz w:val="26"/>
+              </w:rPr>
+              <w:t>Containment 75%, CSAT ≥ 4,5/5, 0 sự cố cờ đỏ.</w:t>
+            </w:r>
+          </w:p>
+        </w:tc>
+        <w:tc>
+          <w:tcPr>
+            <w:tcMar>
+              <w:top w:w="60.0" w:type="dxa"/>
+              <w:left w:w="100.0" w:type="dxa"/>
+              <w:bottom w:w="60.0" w:type="dxa"/>
+              <w:right w:w="100.0" w:type="dxa"/>
+            </w:tcMar>
+          </w:tcPr>
+          <w:p>
+            <w:r>
+              <w:rPr>
+                <w:rFonts w:ascii="Times New Roman" w:hAnsi="Times New Roman" w:cs="Times New Roman"/>
+                <w:b w:val="0"/>
+                <w:sz w:val="26"/>
+              </w:rPr>
+              <w:t>Containment ≥ 78%, GM ≥ 71%, thời gian chờ giảm 80%.</w:t>
+            </w:r>
+          </w:p>
+        </w:tc>
+        <w:tc>
+          <w:tcPr>
+            <w:tcMar>
+              <w:top w:w="60.0" w:type="dxa"/>
+              <w:left w:w="100.0" w:type="dxa"/>
+              <w:bottom w:w="60.0" w:type="dxa"/>
+              <w:right w:w="100.0" w:type="dxa"/>
+            </w:tcMar>
+          </w:tcPr>
+          <w:p>
+            <w:r>
+              <w:rPr>
+                <w:rFonts w:ascii="Times New Roman" w:hAnsi="Times New Roman" w:cs="Times New Roman"/>
+                <w:b w:val="0"/>
+                <w:sz w:val="26"/>
+              </w:rPr>
+              <w:t>ARR đạt $380.000, CAC Payback &lt; 8 tháng, NRR &gt; 120%.</w:t>
             </w:r>
           </w:p>
         </w:tc>
@@ -2701,12 +3002,12 @@
             </w:pPr>
             <w:r>
               <w:rPr>
-                <w:rFonts w:ascii="Arial" w:cs="Arial" w:eastAsia="Arial" w:hAnsi="Arial"/>
-                <w:b w:val="1"/>
+                <w:rFonts w:ascii="Times New Roman" w:cs="Times New Roman" w:eastAsia="Arial" w:hAnsi="Times New Roman"/>
+                <w:b w:val="0"/>
                 <w:bCs w:val="1"/>
                 <w:i w:val="0"/>
                 <w:iCs w:val="0"/>
-                <w:sz w:val="16"/>
+                <w:sz w:val="26"/>
                 <w:szCs w:val="16"/>
                 <w:rtl w:val="0"/>
               </w:rPr>
@@ -2714,53 +3015,71 @@
             </w:r>
             <w:r>
               <w:rPr>
-                <w:rtl w:val="0"/>
-              </w:rPr>
-            </w:r>
-          </w:p>
-        </w:tc>
-        <w:tc>
-          <w:tcPr>
-            <w:tcMar>
-              <w:top w:w="60.0" w:type="dxa"/>
-              <w:left w:w="100.0" w:type="dxa"/>
-              <w:bottom w:w="60.0" w:type="dxa"/>
-              <w:right w:w="100.0" w:type="dxa"/>
-            </w:tcMar>
-          </w:tcPr>
-          <w:p>
-            <w:r>
-              <w:t>Ninh Quang Minh (Product Lead) &amp; BS. Trưởng khoa Cấp cứu Vinmec</w:t>
-            </w:r>
-          </w:p>
-        </w:tc>
-        <w:tc>
-          <w:tcPr>
-            <w:tcMar>
-              <w:top w:w="60.0" w:type="dxa"/>
-              <w:left w:w="100.0" w:type="dxa"/>
-              <w:bottom w:w="60.0" w:type="dxa"/>
-              <w:right w:w="100.0" w:type="dxa"/>
-            </w:tcMar>
-          </w:tcPr>
-          <w:p>
-            <w:r>
-              <w:t>Ninh Quang Minh (Product Lead) &amp; Đội Kỹ thuật Tích hợp HIS Vinmec</w:t>
-            </w:r>
-          </w:p>
-        </w:tc>
-        <w:tc>
-          <w:tcPr>
-            <w:tcMar>
-              <w:top w:w="60.0" w:type="dxa"/>
-              <w:left w:w="100.0" w:type="dxa"/>
-              <w:bottom w:w="60.0" w:type="dxa"/>
-              <w:right w:w="100.0" w:type="dxa"/>
-            </w:tcMar>
-          </w:tcPr>
-          <w:p>
-            <w:r>
-              <w:t>Head of Business Development &amp; Ninh Quang Minh</w:t>
+                <w:rFonts w:ascii="Times New Roman" w:hAnsi="Times New Roman" w:cs="Times New Roman"/>
+                <w:b w:val="0"/>
+                <w:sz w:val="26"/>
+                <w:rtl w:val="0"/>
+              </w:rPr>
+            </w:r>
+          </w:p>
+        </w:tc>
+        <w:tc>
+          <w:tcPr>
+            <w:tcMar>
+              <w:top w:w="60.0" w:type="dxa"/>
+              <w:left w:w="100.0" w:type="dxa"/>
+              <w:bottom w:w="60.0" w:type="dxa"/>
+              <w:right w:w="100.0" w:type="dxa"/>
+            </w:tcMar>
+          </w:tcPr>
+          <w:p>
+            <w:r>
+              <w:rPr>
+                <w:rFonts w:ascii="Times New Roman" w:hAnsi="Times New Roman" w:cs="Times New Roman"/>
+                <w:b w:val="0"/>
+                <w:sz w:val="26"/>
+              </w:rPr>
+              <w:t>Ninh Quang Minh (Product Lead) &amp; Trưởng khoa Cấp cứu</w:t>
+            </w:r>
+          </w:p>
+        </w:tc>
+        <w:tc>
+          <w:tcPr>
+            <w:tcMar>
+              <w:top w:w="60.0" w:type="dxa"/>
+              <w:left w:w="100.0" w:type="dxa"/>
+              <w:bottom w:w="60.0" w:type="dxa"/>
+              <w:right w:w="100.0" w:type="dxa"/>
+            </w:tcMar>
+          </w:tcPr>
+          <w:p>
+            <w:r>
+              <w:rPr>
+                <w:rFonts w:ascii="Times New Roman" w:hAnsi="Times New Roman" w:cs="Times New Roman"/>
+                <w:b w:val="0"/>
+                <w:sz w:val="26"/>
+              </w:rPr>
+              <w:t>Ninh Quang Minh &amp; Đội ngũ Kỹ thuật HIS</w:t>
+            </w:r>
+          </w:p>
+        </w:tc>
+        <w:tc>
+          <w:tcPr>
+            <w:tcMar>
+              <w:top w:w="60.0" w:type="dxa"/>
+              <w:left w:w="100.0" w:type="dxa"/>
+              <w:bottom w:w="60.0" w:type="dxa"/>
+              <w:right w:w="100.0" w:type="dxa"/>
+            </w:tcMar>
+          </w:tcPr>
+          <w:p>
+            <w:r>
+              <w:rPr>
+                <w:rFonts w:ascii="Times New Roman" w:hAnsi="Times New Roman" w:cs="Times New Roman"/>
+                <w:b w:val="0"/>
+                <w:sz w:val="26"/>
+              </w:rPr>
+              <w:t>Đội ngũ Phát triển kinh doanh &amp; Ninh Quang Minh</w:t>
             </w:r>
           </w:p>
         </w:tc>
@@ -2772,6 +3091,8 @@
       </w:pPr>
       <w:r>
         <w:rPr>
+          <w:rFonts w:ascii="Times New Roman" w:hAnsi="Times New Roman" w:cs="Times New Roman"/>
+          <w:sz w:val="26"/>
           <w:rtl w:val="0"/>
         </w:rPr>
         <w:br w:type="textWrapping"/>
@@ -2784,11 +3105,11 @@
       </w:pPr>
       <w:r>
         <w:rPr>
-          <w:rFonts w:ascii="Arial" w:cs="Arial" w:eastAsia="Arial" w:hAnsi="Arial"/>
-          <w:b w:val="1"/>
+          <w:rFonts w:ascii="Times New Roman" w:cs="Times New Roman" w:eastAsia="Arial" w:hAnsi="Times New Roman"/>
+          <w:b/>
           <w:bCs w:val="1"/>
           <w:color w:val="4f46e5"/>
-          <w:sz w:val="24"/>
+          <w:sz w:val="28"/>
           <w:szCs w:val="24"/>
           <w:rtl w:val="0"/>
         </w:rPr>
@@ -2796,6 +3117,9 @@
       </w:r>
       <w:r>
         <w:rPr>
+          <w:rFonts w:ascii="Times New Roman" w:hAnsi="Times New Roman" w:cs="Times New Roman"/>
+          <w:b/>
+          <w:sz w:val="28"/>
           <w:rtl w:val="0"/>
         </w:rPr>
       </w:r>
@@ -2807,11 +3131,11 @@
       </w:pPr>
       <w:r>
         <w:rPr>
-          <w:rFonts w:ascii="Arial" w:cs="Arial" w:eastAsia="Arial" w:hAnsi="Arial"/>
+          <w:rFonts w:ascii="Times New Roman" w:cs="Times New Roman" w:eastAsia="Arial" w:hAnsi="Times New Roman"/>
           <w:i w:val="1"/>
           <w:iCs w:val="1"/>
           <w:color w:val="666666"/>
-          <w:sz w:val="15"/>
+          <w:sz w:val="26"/>
           <w:szCs w:val="15"/>
           <w:rtl w:val="0"/>
         </w:rPr>
@@ -2819,6 +3143,8 @@
       </w:r>
       <w:r>
         <w:rPr>
+          <w:rFonts w:ascii="Times New Roman" w:hAnsi="Times New Roman" w:cs="Times New Roman"/>
+          <w:sz w:val="26"/>
           <w:rtl w:val="0"/>
         </w:rPr>
       </w:r>
@@ -2875,12 +3201,12 @@
             </w:pPr>
             <w:r>
               <w:rPr>
-                <w:rFonts w:ascii="Arial" w:cs="Arial" w:eastAsia="Arial" w:hAnsi="Arial"/>
-                <w:b w:val="1"/>
+                <w:rFonts w:ascii="Times New Roman" w:cs="Times New Roman" w:eastAsia="Arial" w:hAnsi="Times New Roman"/>
+                <w:b/>
                 <w:bCs w:val="1"/>
                 <w:i w:val="0"/>
                 <w:iCs w:val="0"/>
-                <w:sz w:val="18"/>
+                <w:sz w:val="26"/>
                 <w:szCs w:val="18"/>
                 <w:rtl w:val="0"/>
               </w:rPr>
@@ -2888,6 +3214,9 @@
             </w:r>
             <w:r>
               <w:rPr>
+                <w:rFonts w:ascii="Times New Roman" w:hAnsi="Times New Roman" w:cs="Times New Roman"/>
+                <w:b/>
+                <w:sz w:val="26"/>
                 <w:rtl w:val="0"/>
               </w:rPr>
             </w:r>
@@ -2910,12 +3239,12 @@
             </w:pPr>
             <w:r>
               <w:rPr>
-                <w:rFonts w:ascii="Arial" w:cs="Arial" w:eastAsia="Arial" w:hAnsi="Arial"/>
-                <w:b w:val="1"/>
+                <w:rFonts w:ascii="Times New Roman" w:cs="Times New Roman" w:eastAsia="Arial" w:hAnsi="Times New Roman"/>
+                <w:b/>
                 <w:bCs w:val="1"/>
                 <w:i w:val="0"/>
                 <w:iCs w:val="0"/>
-                <w:sz w:val="18"/>
+                <w:sz w:val="26"/>
                 <w:szCs w:val="18"/>
                 <w:rtl w:val="0"/>
               </w:rPr>
@@ -2923,6 +3252,9 @@
             </w:r>
             <w:r>
               <w:rPr>
+                <w:rFonts w:ascii="Times New Roman" w:hAnsi="Times New Roman" w:cs="Times New Roman"/>
+                <w:b/>
+                <w:sz w:val="26"/>
                 <w:rtl w:val="0"/>
               </w:rPr>
             </w:r>
@@ -2945,12 +3277,12 @@
             </w:pPr>
             <w:r>
               <w:rPr>
-                <w:rFonts w:ascii="Arial" w:cs="Arial" w:eastAsia="Arial" w:hAnsi="Arial"/>
-                <w:b w:val="1"/>
+                <w:rFonts w:ascii="Times New Roman" w:cs="Times New Roman" w:eastAsia="Arial" w:hAnsi="Times New Roman"/>
+                <w:b/>
                 <w:bCs w:val="1"/>
                 <w:i w:val="0"/>
                 <w:iCs w:val="0"/>
-                <w:sz w:val="18"/>
+                <w:sz w:val="26"/>
                 <w:szCs w:val="18"/>
                 <w:rtl w:val="0"/>
               </w:rPr>
@@ -2958,6 +3290,9 @@
             </w:r>
             <w:r>
               <w:rPr>
+                <w:rFonts w:ascii="Times New Roman" w:hAnsi="Times New Roman" w:cs="Times New Roman"/>
+                <w:b/>
+                <w:sz w:val="26"/>
                 <w:rtl w:val="0"/>
               </w:rPr>
             </w:r>
@@ -2980,12 +3315,12 @@
             </w:pPr>
             <w:r>
               <w:rPr>
-                <w:rFonts w:ascii="Arial" w:cs="Arial" w:eastAsia="Arial" w:hAnsi="Arial"/>
-                <w:b w:val="1"/>
+                <w:rFonts w:ascii="Times New Roman" w:cs="Times New Roman" w:eastAsia="Arial" w:hAnsi="Times New Roman"/>
+                <w:b/>
                 <w:bCs w:val="1"/>
                 <w:i w:val="0"/>
                 <w:iCs w:val="0"/>
-                <w:sz w:val="18"/>
+                <w:sz w:val="26"/>
                 <w:szCs w:val="18"/>
                 <w:rtl w:val="0"/>
               </w:rPr>
@@ -2993,6 +3328,9 @@
             </w:r>
             <w:r>
               <w:rPr>
+                <w:rFonts w:ascii="Times New Roman" w:hAnsi="Times New Roman" w:cs="Times New Roman"/>
+                <w:b/>
+                <w:sz w:val="26"/>
                 <w:rtl w:val="0"/>
               </w:rPr>
             </w:r>
@@ -3020,12 +3358,12 @@
             </w:pPr>
             <w:r>
               <w:rPr>
-                <w:rFonts w:ascii="Arial" w:cs="Arial" w:eastAsia="Arial" w:hAnsi="Arial"/>
-                <w:b w:val="1"/>
+                <w:rFonts w:ascii="Times New Roman" w:cs="Times New Roman" w:eastAsia="Arial" w:hAnsi="Times New Roman"/>
+                <w:b w:val="0"/>
                 <w:bCs w:val="1"/>
                 <w:i w:val="0"/>
                 <w:iCs w:val="0"/>
-                <w:sz w:val="17"/>
+                <w:sz w:val="26"/>
                 <w:szCs w:val="17"/>
                 <w:rtl w:val="0"/>
               </w:rPr>
@@ -3033,22 +3371,30 @@
             </w:r>
             <w:r>
               <w:rPr>
-                <w:rtl w:val="0"/>
-              </w:rPr>
-            </w:r>
-          </w:p>
-        </w:tc>
-        <w:tc>
-          <w:tcPr>
-            <w:tcMar>
-              <w:top w:w="60.0" w:type="dxa"/>
-              <w:left w:w="100.0" w:type="dxa"/>
-              <w:bottom w:w="60.0" w:type="dxa"/>
-              <w:right w:w="100.0" w:type="dxa"/>
-            </w:tcMar>
-          </w:tcPr>
-          <w:p>
-            <w:r>
+                <w:rFonts w:ascii="Times New Roman" w:hAnsi="Times New Roman" w:cs="Times New Roman"/>
+                <w:b w:val="0"/>
+                <w:sz w:val="26"/>
+                <w:rtl w:val="0"/>
+              </w:rPr>
+            </w:r>
+          </w:p>
+        </w:tc>
+        <w:tc>
+          <w:tcPr>
+            <w:tcMar>
+              <w:top w:w="60.0" w:type="dxa"/>
+              <w:left w:w="100.0" w:type="dxa"/>
+              <w:bottom w:w="60.0" w:type="dxa"/>
+              <w:right w:w="100.0" w:type="dxa"/>
+            </w:tcMar>
+          </w:tcPr>
+          <w:p>
+            <w:r>
+              <w:rPr>
+                <w:rFonts w:ascii="Times New Roman" w:hAnsi="Times New Roman" w:cs="Times New Roman"/>
+                <w:b w:val="0"/>
+                <w:sz w:val="26"/>
+              </w:rPr>
               <w:t>Đã có</w:t>
             </w:r>
           </w:p>
@@ -3064,22 +3410,32 @@
           </w:tcPr>
           <w:p>
             <w:r>
-              <w:t>Bộ test 960 vignette lâm sàng (Nature Medicine protocol): Triage chính xác 94,2%, undertriage ca cấp cứu &lt; 3,5%, 78% giải quyết tự động, 22% escalate an toàn.</w:t>
-            </w:r>
-          </w:p>
-        </w:tc>
-        <w:tc>
-          <w:tcPr>
-            <w:tcMar>
-              <w:top w:w="60.0" w:type="dxa"/>
-              <w:left w:w="100.0" w:type="dxa"/>
-              <w:bottom w:w="60.0" w:type="dxa"/>
-              <w:right w:w="100.0" w:type="dxa"/>
-            </w:tcMar>
-          </w:tcPr>
-          <w:p>
-            <w:r>
-              <w:t>Ninh Quang Minh · Đã hoàn thành (07/10/2026)</w:t>
+              <w:rPr>
+                <w:rFonts w:ascii="Times New Roman" w:hAnsi="Times New Roman" w:cs="Times New Roman"/>
+                <w:b w:val="0"/>
+                <w:sz w:val="26"/>
+              </w:rPr>
+              <w:t>Bộ test 960 vignette lâm sàng (Nature Medicine): Triage chính xác 94,2%, undertriage ca cấp cứu &lt; 3,5%, containment 78%, chuyển tiếp điều dưỡng 22%.</w:t>
+            </w:r>
+          </w:p>
+        </w:tc>
+        <w:tc>
+          <w:tcPr>
+            <w:tcMar>
+              <w:top w:w="60.0" w:type="dxa"/>
+              <w:left w:w="100.0" w:type="dxa"/>
+              <w:bottom w:w="60.0" w:type="dxa"/>
+              <w:right w:w="100.0" w:type="dxa"/>
+            </w:tcMar>
+          </w:tcPr>
+          <w:p>
+            <w:r>
+              <w:rPr>
+                <w:rFonts w:ascii="Times New Roman" w:hAnsi="Times New Roman" w:cs="Times New Roman"/>
+                <w:b w:val="0"/>
+                <w:sz w:val="26"/>
+              </w:rPr>
+              <w:t>Ninh Quang Minh · 07/10/2026</w:t>
             </w:r>
           </w:p>
         </w:tc>
@@ -3105,12 +3461,12 @@
             </w:pPr>
             <w:r>
               <w:rPr>
-                <w:rFonts w:ascii="Arial" w:cs="Arial" w:eastAsia="Arial" w:hAnsi="Arial"/>
-                <w:b w:val="1"/>
+                <w:rFonts w:ascii="Times New Roman" w:cs="Times New Roman" w:eastAsia="Arial" w:hAnsi="Times New Roman"/>
+                <w:b w:val="0"/>
                 <w:bCs w:val="1"/>
                 <w:i w:val="0"/>
                 <w:iCs w:val="0"/>
-                <w:sz w:val="17"/>
+                <w:sz w:val="26"/>
                 <w:szCs w:val="17"/>
                 <w:rtl w:val="0"/>
               </w:rPr>
@@ -3118,22 +3474,30 @@
             </w:r>
             <w:r>
               <w:rPr>
-                <w:rtl w:val="0"/>
-              </w:rPr>
-            </w:r>
-          </w:p>
-        </w:tc>
-        <w:tc>
-          <w:tcPr>
-            <w:tcMar>
-              <w:top w:w="60.0" w:type="dxa"/>
-              <w:left w:w="100.0" w:type="dxa"/>
-              <w:bottom w:w="60.0" w:type="dxa"/>
-              <w:right w:w="100.0" w:type="dxa"/>
-            </w:tcMar>
-          </w:tcPr>
-          <w:p>
-            <w:r>
+                <w:rFonts w:ascii="Times New Roman" w:hAnsi="Times New Roman" w:cs="Times New Roman"/>
+                <w:b w:val="0"/>
+                <w:sz w:val="26"/>
+                <w:rtl w:val="0"/>
+              </w:rPr>
+            </w:r>
+          </w:p>
+        </w:tc>
+        <w:tc>
+          <w:tcPr>
+            <w:tcMar>
+              <w:top w:w="60.0" w:type="dxa"/>
+              <w:left w:w="100.0" w:type="dxa"/>
+              <w:bottom w:w="60.0" w:type="dxa"/>
+              <w:right w:w="100.0" w:type="dxa"/>
+            </w:tcMar>
+          </w:tcPr>
+          <w:p>
+            <w:r>
+              <w:rPr>
+                <w:rFonts w:ascii="Times New Roman" w:hAnsi="Times New Roman" w:cs="Times New Roman"/>
+                <w:b w:val="0"/>
+                <w:sz w:val="26"/>
+              </w:rPr>
               <w:t>Đã có</w:t>
             </w:r>
           </w:p>
@@ -3149,22 +3513,32 @@
           </w:tcPr>
           <w:p>
             <w:r>
-              <w:t>Bộ giải trình 3 câu hỏi Procurement &amp; Clinical Governance: 100% không hallucinate chẩn đoán (chỉ triage ESI, cờ đỏ chuyển tuyến tức thì); cam kết Zero Data Retention qua Azure/Anthropic Enterprise, tuân thủ Nghị định 13/2023/NĐ-CP &amp; HIPAA; toàn bộ dữ liệu lưu trên Private Cloud Vinmec.</w:t>
-            </w:r>
-          </w:p>
-        </w:tc>
-        <w:tc>
-          <w:tcPr>
-            <w:tcMar>
-              <w:top w:w="60.0" w:type="dxa"/>
-              <w:left w:w="100.0" w:type="dxa"/>
-              <w:bottom w:w="60.0" w:type="dxa"/>
-              <w:right w:w="100.0" w:type="dxa"/>
-            </w:tcMar>
-          </w:tcPr>
-          <w:p>
-            <w:r>
-              <w:t>Ninh Quang Minh · Đã hoàn thành (08/10/2026)</w:t>
+              <w:rPr>
+                <w:rFonts w:ascii="Times New Roman" w:hAnsi="Times New Roman" w:cs="Times New Roman"/>
+                <w:b w:val="0"/>
+                <w:sz w:val="26"/>
+              </w:rPr>
+              <w:t>Báo cáo Procurement: Guardrail không chẩn đoán xác định, cam kết Zero Data Retention qua Azure/Anthropic Enterprise, lưu trữ tại Private Cloud Vinmec.</w:t>
+            </w:r>
+          </w:p>
+        </w:tc>
+        <w:tc>
+          <w:tcPr>
+            <w:tcMar>
+              <w:top w:w="60.0" w:type="dxa"/>
+              <w:left w:w="100.0" w:type="dxa"/>
+              <w:bottom w:w="60.0" w:type="dxa"/>
+              <w:right w:w="100.0" w:type="dxa"/>
+            </w:tcMar>
+          </w:tcPr>
+          <w:p>
+            <w:r>
+              <w:rPr>
+                <w:rFonts w:ascii="Times New Roman" w:hAnsi="Times New Roman" w:cs="Times New Roman"/>
+                <w:b w:val="0"/>
+                <w:sz w:val="26"/>
+              </w:rPr>
+              <w:t>Ninh Quang Minh · 08/10/2026</w:t>
             </w:r>
           </w:p>
         </w:tc>
@@ -3190,12 +3564,12 @@
             </w:pPr>
             <w:r>
               <w:rPr>
-                <w:rFonts w:ascii="Arial" w:cs="Arial" w:eastAsia="Arial" w:hAnsi="Arial"/>
-                <w:b w:val="1"/>
+                <w:rFonts w:ascii="Times New Roman" w:cs="Times New Roman" w:eastAsia="Arial" w:hAnsi="Times New Roman"/>
+                <w:b w:val="0"/>
                 <w:bCs w:val="1"/>
                 <w:i w:val="0"/>
                 <w:iCs w:val="0"/>
-                <w:sz w:val="17"/>
+                <w:sz w:val="26"/>
                 <w:szCs w:val="17"/>
                 <w:rtl w:val="0"/>
               </w:rPr>
@@ -3203,22 +3577,30 @@
             </w:r>
             <w:r>
               <w:rPr>
-                <w:rtl w:val="0"/>
-              </w:rPr>
-            </w:r>
-          </w:p>
-        </w:tc>
-        <w:tc>
-          <w:tcPr>
-            <w:tcMar>
-              <w:top w:w="60.0" w:type="dxa"/>
-              <w:left w:w="100.0" w:type="dxa"/>
-              <w:bottom w:w="60.0" w:type="dxa"/>
-              <w:right w:w="100.0" w:type="dxa"/>
-            </w:tcMar>
-          </w:tcPr>
-          <w:p>
-            <w:r>
+                <w:rFonts w:ascii="Times New Roman" w:hAnsi="Times New Roman" w:cs="Times New Roman"/>
+                <w:b w:val="0"/>
+                <w:sz w:val="26"/>
+                <w:rtl w:val="0"/>
+              </w:rPr>
+            </w:r>
+          </w:p>
+        </w:tc>
+        <w:tc>
+          <w:tcPr>
+            <w:tcMar>
+              <w:top w:w="60.0" w:type="dxa"/>
+              <w:left w:w="100.0" w:type="dxa"/>
+              <w:bottom w:w="60.0" w:type="dxa"/>
+              <w:right w:w="100.0" w:type="dxa"/>
+            </w:tcMar>
+          </w:tcPr>
+          <w:p>
+            <w:r>
+              <w:rPr>
+                <w:rFonts w:ascii="Times New Roman" w:hAnsi="Times New Roman" w:cs="Times New Roman"/>
+                <w:b w:val="0"/>
+                <w:sz w:val="26"/>
+              </w:rPr>
               <w:t>Chưa có</w:t>
             </w:r>
           </w:p>
@@ -3234,22 +3616,32 @@
           </w:tcPr>
           <w:p>
             <w:r>
-              <w:t>Thử nghiệm lâm sàng 4 tuần tại BVĐKQT Vinmec Times City: 1.500 ca tiếp nhận, 78% containment, tiết kiệm 200 giờ trực điều dưỡng, giảm 35% ca chờ đợi tại Cấp cứu.</w:t>
-            </w:r>
-          </w:p>
-        </w:tc>
-        <w:tc>
-          <w:tcPr>
-            <w:tcMar>
-              <w:top w:w="60.0" w:type="dxa"/>
-              <w:left w:w="100.0" w:type="dxa"/>
-              <w:bottom w:w="60.0" w:type="dxa"/>
-              <w:right w:w="100.0" w:type="dxa"/>
-            </w:tcMar>
-          </w:tcPr>
-          <w:p>
-            <w:r>
-              <w:t>Ninh Quang Minh &amp; BS. Trưởng khoa Cấp cứu · Deadline: 15/11/2026</w:t>
+              <w:rPr>
+                <w:rFonts w:ascii="Times New Roman" w:hAnsi="Times New Roman" w:cs="Times New Roman"/>
+                <w:b w:val="0"/>
+                <w:sz w:val="26"/>
+              </w:rPr>
+              <w:t>Thử nghiệm lâm sàng 4 tuần tại BV Vinmec Times City: 1.500 ca tiếp nhận, containment 78%, tiết kiệm 200 giờ trực điều dưỡng, giảm 35% ca chờ tại cấp cứu.</w:t>
+            </w:r>
+          </w:p>
+        </w:tc>
+        <w:tc>
+          <w:tcPr>
+            <w:tcMar>
+              <w:top w:w="60.0" w:type="dxa"/>
+              <w:left w:w="100.0" w:type="dxa"/>
+              <w:bottom w:w="60.0" w:type="dxa"/>
+              <w:right w:w="100.0" w:type="dxa"/>
+            </w:tcMar>
+          </w:tcPr>
+          <w:p>
+            <w:r>
+              <w:rPr>
+                <w:rFonts w:ascii="Times New Roman" w:hAnsi="Times New Roman" w:cs="Times New Roman"/>
+                <w:b w:val="0"/>
+                <w:sz w:val="26"/>
+              </w:rPr>
+              <w:t>Ninh Quang Minh &amp; Trưởng khoa Cấp cứu · 15/11/2026</w:t>
             </w:r>
           </w:p>
         </w:tc>
@@ -3262,6 +3654,8 @@
       </w:pPr>
       <w:r>
         <w:rPr>
+          <w:rFonts w:ascii="Times New Roman" w:hAnsi="Times New Roman" w:cs="Times New Roman"/>
+          <w:sz w:val="26"/>
           <w:rtl w:val="0"/>
         </w:rPr>
       </w:r>
@@ -3273,11 +3667,11 @@
       </w:pPr>
       <w:r>
         <w:rPr>
-          <w:rFonts w:ascii="Arial" w:cs="Arial" w:eastAsia="Arial" w:hAnsi="Arial"/>
+          <w:rFonts w:ascii="Times New Roman" w:cs="Times New Roman" w:eastAsia="Arial" w:hAnsi="Times New Roman"/>
           <w:b w:val="1"/>
           <w:bCs w:val="1"/>
           <w:color w:val="4f46e5"/>
-          <w:sz w:val="18"/>
+          <w:sz w:val="26"/>
           <w:szCs w:val="18"/>
           <w:rtl w:val="0"/>
         </w:rPr>
@@ -3285,6 +3679,8 @@
       </w:r>
       <w:r>
         <w:rPr>
+          <w:rFonts w:ascii="Times New Roman" w:hAnsi="Times New Roman" w:cs="Times New Roman"/>
+          <w:sz w:val="26"/>
           <w:rtl w:val="0"/>
         </w:rPr>
       </w:r>
@@ -3296,11 +3692,11 @@
       </w:pPr>
       <w:r>
         <w:rPr>
-          <w:rFonts w:ascii="Arial" w:cs="Arial" w:eastAsia="Arial" w:hAnsi="Arial"/>
+          <w:rFonts w:ascii="Times New Roman" w:cs="Times New Roman" w:eastAsia="Arial" w:hAnsi="Times New Roman"/>
           <w:i w:val="1"/>
           <w:iCs w:val="1"/>
           <w:color w:val="666666"/>
-          <w:sz w:val="15"/>
+          <w:sz w:val="26"/>
           <w:szCs w:val="15"/>
           <w:rtl w:val="0"/>
         </w:rPr>
@@ -3308,6 +3704,8 @@
       </w:r>
       <w:r>
         <w:rPr>
+          <w:rFonts w:ascii="Times New Roman" w:hAnsi="Times New Roman" w:cs="Times New Roman"/>
+          <w:sz w:val="26"/>
           <w:rtl w:val="0"/>
         </w:rPr>
       </w:r>
@@ -3318,7 +3716,11 @@
         <w:rPr/>
       </w:pPr>
       <w:r>
-        <w:t>☑  Bạn bán gì, cho ai, tính tiền theo đơn vị nào?</w:t>
+        <w:rPr>
+          <w:rFonts w:ascii="Times New Roman" w:hAnsi="Times New Roman" w:cs="Times New Roman"/>
+          <w:sz w:val="26"/>
+        </w:rPr>
+        <w:t>☑ Bạn bán gì, cho ai, tính tiền theo đơn vị nào?</w:t>
       </w:r>
     </w:p>
     <w:p>
@@ -3327,7 +3729,11 @@
         <w:rPr/>
       </w:pPr>
       <w:r>
-        <w:t>☑  Có lãi trên mỗi đơn vị không — con số nào chứng minh?</w:t>
+        <w:rPr>
+          <w:rFonts w:ascii="Times New Roman" w:hAnsi="Times New Roman" w:cs="Times New Roman"/>
+          <w:sz w:val="26"/>
+        </w:rPr>
+        <w:t>☑ Có lãi trên mỗi đơn vị không — con số nào chứng minh?</w:t>
       </w:r>
     </w:p>
     <w:p>
@@ -3336,7 +3742,11 @@
         <w:rPr/>
       </w:pPr>
       <w:r>
-        <w:t>☑  Tiếp cận khách qua đâu — và vì sao là kênh đó?</w:t>
+        <w:rPr>
+          <w:rFonts w:ascii="Times New Roman" w:hAnsi="Times New Roman" w:cs="Times New Roman"/>
+          <w:sz w:val="26"/>
+        </w:rPr>
+        <w:t>☑ Tiếp cận khách qua đâu — và vì sao là kênh đó?</w:t>
       </w:r>
     </w:p>
     <w:p>
@@ -3345,6 +3755,10 @@
         <w:rPr/>
       </w:pPr>
       <w:r>
+        <w:rPr>
+          <w:rFonts w:ascii="Times New Roman" w:hAnsi="Times New Roman" w:cs="Times New Roman"/>
+          <w:sz w:val="26"/>
+        </w:rPr>
         <w:t>Số câu người đọc phải hỏi lại: 0  (mục tiêu ≤ 3)</w:t>
       </w:r>
     </w:p>
@@ -3356,13 +3770,13 @@
       </w:pPr>
       <w:r>
         <w:rPr>
-          <w:rFonts w:ascii="Arial" w:cs="Arial" w:eastAsia="Arial" w:hAnsi="Arial"/>
+          <w:rFonts w:ascii="Times New Roman" w:cs="Times New Roman" w:eastAsia="Arial" w:hAnsi="Times New Roman"/>
           <w:b w:val="1"/>
           <w:bCs w:val="1"/>
           <w:i w:val="1"/>
           <w:iCs w:val="1"/>
           <w:color w:val="666666"/>
-          <w:sz w:val="20"/>
+          <w:sz w:val="26"/>
           <w:szCs w:val="20"/>
           <w:rtl w:val="0"/>
         </w:rPr>
@@ -3370,6 +3784,8 @@
       </w:r>
       <w:r>
         <w:rPr>
+          <w:rFonts w:ascii="Times New Roman" w:hAnsi="Times New Roman" w:cs="Times New Roman"/>
+          <w:sz w:val="26"/>
           <w:rtl w:val="0"/>
         </w:rPr>
       </w:r>
@@ -3412,6 +3828,11 @@
   </w:style>
   <w:style w:type="paragraph" w:styleId="Normal" w:default="1">
     <w:name w:val="normal"/>
+    <w:rPr>
+      <w:rFonts w:ascii="Times New Roman" w:hAnsi="Times New Roman"/>
+      <w:color w:val="1F2937"/>
+      <w:sz w:val="26"/>
+    </w:rPr>
   </w:style>
   <w:style w:type="paragraph" w:styleId="Heading1">
     <w:name w:val="heading 1"/>

</xml_diff>